<commit_message>
Mock 1: no setup block; NFS server and node2 repo become tasks
- Drop Mock 1's pre-exam commands. The candidate starts from two clean
  VMs and builds node2's ISO repo (task 4) and NFS server (task 5).
  Old tasks 4-18 are now 6-20; 170 minutes.
- Graders identify node1/node2 by IP, so lab hostnames don't matter.
- The swap disk for task 13 may be any size of 1 GiB or more.

Co-Authored-By: Claude Opus 5.5 <noreply@anthropic.com>
</commit_message>
<xml_diff>
--- a/exams/ph2026b2/mock-1/RHCSA9_Mock_Exam_1.docx
+++ b/exams/ph2026b2/mock-1/RHCSA9_Mock_Exam_1.docx
@@ -29,14 +29,14 @@
           <w:b w:val="0"/>
           <w:sz w:val="21"/>
         </w:rPr>
-        <w:t xml:space="preserve">Every task follows PH2026B2 Practical Exams 1–3 exactly, with different names and values. Not a full EX200 paper. </w:t>
+        <w:t xml:space="preserve">Every task follows PH2026B2 Practical Exams 1–3, with different names and values. Not a full EX200 paper. </w:t>
       </w:r>
       <w:r>
         <w:rPr>
           <w:b/>
           <w:sz w:val="21"/>
         </w:rPr>
-        <w:t>Time: 150 minutes.</w:t>
+        <w:t>Time: 170 minutes.</w:t>
       </w:r>
       <w:r>
         <w:rPr>
@@ -249,7 +249,7 @@
                 <w:b w:val="0"/>
                 <w:sz w:val="19"/>
               </w:rPr>
-              <w:t xml:space="preserve"> (1 GiB). Internet access for the container image only.</w:t>
+              <w:t xml:space="preserve"> (any size, 1 GiB or more).</w:t>
             </w:r>
           </w:p>
         </w:tc>
@@ -308,39 +308,7 @@
                 <w:b w:val="0"/>
                 <w:sz w:val="19"/>
               </w:rPr>
-              <w:t xml:space="preserve">Already configured as an NFS server, exporting </w:t>
-            </w:r>
-            <w:r>
-              <w:rPr>
-                <w:rFonts w:ascii="Courier New" w:hAnsi="Courier New" w:eastAsia="Courier New"/>
-                <w:b w:val="0"/>
-                <w:color w:val="C2560B"/>
-                <w:sz w:val="17"/>
-              </w:rPr>
-              <w:t>/exports/projects</w:t>
-            </w:r>
-            <w:r>
-              <w:rPr>
-                <w:b w:val="0"/>
-                <w:sz w:val="19"/>
-              </w:rPr>
-              <w:t xml:space="preserve"> and </w:t>
-            </w:r>
-            <w:r>
-              <w:rPr>
-                <w:rFonts w:ascii="Courier New" w:hAnsi="Courier New" w:eastAsia="Courier New"/>
-                <w:b w:val="0"/>
-                <w:color w:val="C2560B"/>
-                <w:sz w:val="17"/>
-              </w:rPr>
-              <w:t>/exports/docs</w:t>
-            </w:r>
-            <w:r>
-              <w:rPr>
-                <w:b w:val="0"/>
-                <w:sz w:val="19"/>
-              </w:rPr>
-              <w:t>.</w:t>
+              <w:t>You will configure it as the NFS server.</w:t>
             </w:r>
           </w:p>
         </w:tc>
@@ -432,7 +400,7 @@
           <w:b w:val="0"/>
           <w:sz w:val="21"/>
         </w:rPr>
-        <w:t>The RHEL 9 DVD ISO is attached to the optical drive of both VMs. node1 has no repositories configured. Configure further repositories from the ISO if you need them to install packages.</w:t>
+        <w:t>The RHEL 9 DVD ISO is attached to the optical drive of both VMs. Neither node has repositories configured.</w:t>
       </w:r>
     </w:p>
     <w:p>
@@ -451,7 +419,7 @@
           <w:b w:val="0"/>
           <w:sz w:val="21"/>
         </w:rPr>
-        <w:t>You know neither root password.</w:t>
+        <w:t>Treat both root passwords as unknown.</w:t>
       </w:r>
     </w:p>
     <w:p>
@@ -584,7 +552,7 @@
           <w:b w:val="0"/>
           <w:sz w:val="21"/>
         </w:rPr>
-        <w:t>) is allowed. No other internet use.</w:t>
+        <w:t>) is allowed. Internet only for the container image.</w:t>
       </w:r>
     </w:p>
     <w:p>
@@ -601,7 +569,7 @@
           <w:color w:val="000000"/>
           <w:sz w:val="27"/>
         </w:rPr>
-        <w:t>Before you start the clock (lab owner only)</w:t>
+        <w:t>Before you start</w:t>
       </w:r>
     </w:p>
     <w:p>
@@ -614,328 +582,136 @@
           <w:b w:val="0"/>
           <w:sz w:val="21"/>
         </w:rPr>
-        <w:t xml:space="preserve">Confirm disk names with </w:t>
+        <w:t>No commands to type. Check the lab is ready:</w:t>
       </w:r>
+    </w:p>
+    <w:p>
+      <w:pPr>
+        <w:keepNext w:val="0"/>
+        <w:tabs>
+          <w:tab w:pos="605" w:val="left"/>
+        </w:tabs>
+        <w:spacing w:before="120" w:after="60"/>
+        <w:ind w:left="605" w:hanging="605"/>
+      </w:pPr>
       <w:r>
         <w:rPr>
-          <w:rFonts w:ascii="Courier New" w:hAnsi="Courier New" w:eastAsia="Courier New"/>
-          <w:b w:val="0"/>
-          <w:color w:val="C2560B"/>
-          <w:sz w:val="19"/>
+          <w:b/>
+          <w:sz w:val="21"/>
         </w:rPr>
-        <w:t>lsblk</w:t>
+        <w:t>1.</w:t>
+        <w:tab/>
       </w:r>
       <w:r>
         <w:rPr>
           <w:b w:val="0"/>
           <w:sz w:val="21"/>
         </w:rPr>
-        <w:t xml:space="preserve">. Run as root, then power off both VMs and </w:t>
+        <w:t xml:space="preserve">Two clean RHEL 9 VMs, </w:t>
       </w:r>
       <w:r>
         <w:rPr>
           <w:b/>
           <w:sz w:val="21"/>
         </w:rPr>
-        <w:t>snapshot them</w:t>
+        <w:t>node1</w:t>
       </w:r>
       <w:r>
         <w:rPr>
           <w:b w:val="0"/>
           <w:sz w:val="21"/>
         </w:rPr>
-        <w:t>.</w:t>
+        <w:t xml:space="preserve"> and </w:t>
       </w:r>
-    </w:p>
-    <w:p>
-      <w:pPr>
-        <w:spacing w:before="0" w:after="100"/>
-        <w:ind w:left="0"/>
-      </w:pPr>
+      <w:r>
+        <w:rPr>
+          <w:b/>
+          <w:sz w:val="21"/>
+        </w:rPr>
+        <w:t>node2</w:t>
+      </w:r>
       <w:r>
         <w:rPr>
           <w:b w:val="0"/>
           <w:sz w:val="21"/>
         </w:rPr>
-        <w:t>On node2:</w:t>
+        <w:t>, on a shared network with fixed IP addresses that ping each other.</w:t>
       </w:r>
-    </w:p>
-    <w:tbl>
-      <w:tblPr>
-        <w:tblW w:type="auto" w:w="0"/>
-        <w:tblLook w:firstColumn="1" w:firstRow="1" w:lastColumn="0" w:lastRow="0" w:noHBand="0" w:noVBand="1" w:val="04A0"/>
-        <w:tblBorders>
-          <w:top w:val="single" w:sz="4" w:space="0" w:color="D9D9D9"/>
-          <w:left w:val="single" w:sz="4" w:space="0" w:color="D9D9D9"/>
-          <w:bottom w:val="single" w:sz="4" w:space="0" w:color="D9D9D9"/>
-          <w:right w:val="single" w:sz="4" w:space="0" w:color="D9D9D9"/>
-          <w:insideH w:val="single" w:sz="4" w:space="0" w:color="D9D9D9"/>
-          <w:insideV w:val="single" w:sz="4" w:space="0" w:color="D9D9D9"/>
-        </w:tblBorders>
-        <w:tblW w:w="9604" w:type="dxa"/>
-        <w:tblLayout w:type="fixed"/>
-      </w:tblPr>
-      <w:tblGrid>
-        <w:gridCol w:w="9604"/>
-      </w:tblGrid>
-      <w:tr>
-        <w:trPr>
-          <w:cantSplit/>
-        </w:trPr>
-        <w:tc>
-          <w:tcPr>
-            <w:tcW w:type="dxa" w:w="9605"/>
-            <w:tcW w:w="9604" w:type="dxa"/>
-            <w:shd w:val="clear" w:color="auto" w:fill="F6F6F6"/>
-          </w:tcPr>
-          <w:p>
-            <w:pPr>
-              <w:spacing w:before="0" w:after="0" w:line="240" w:lineRule="auto"/>
-            </w:pPr>
-            <w:r>
-              <w:rPr>
-                <w:rFonts w:ascii="Courier New" w:hAnsi="Courier New" w:eastAsia="Courier New"/>
-                <w:sz w:val="17"/>
-              </w:rPr>
-              <w:t>hostnamectl set-hostname node2</w:t>
-            </w:r>
-          </w:p>
-          <w:p>
-            <w:pPr>
-              <w:spacing w:before="0" w:after="0" w:line="240" w:lineRule="auto"/>
-            </w:pPr>
-            <w:r>
-              <w:rPr>
-                <w:rFonts w:ascii="Courier New" w:hAnsi="Courier New" w:eastAsia="Courier New"/>
-                <w:sz w:val="17"/>
-              </w:rPr>
-              <w:t>mount -o ro /dev/sr0 /mnt</w:t>
-            </w:r>
-          </w:p>
-          <w:p>
-            <w:pPr>
-              <w:spacing w:before="0" w:after="0" w:line="240" w:lineRule="auto"/>
-            </w:pPr>
-            <w:r>
-              <w:rPr>
-                <w:rFonts w:ascii="Courier New" w:hAnsi="Courier New" w:eastAsia="Courier New"/>
-                <w:sz w:val="17"/>
-              </w:rPr>
-              <w:t>dnf -y --nogpgcheck --disablerepo='*' --repofrompath=iso,file:///mnt/BaseOS install nfs-utils</w:t>
-            </w:r>
-          </w:p>
-          <w:p>
-            <w:pPr>
-              <w:spacing w:before="0" w:after="0" w:line="240" w:lineRule="auto"/>
-            </w:pPr>
-            <w:r>
-              <w:rPr>
-                <w:rFonts w:ascii="Courier New" w:hAnsi="Courier New" w:eastAsia="Courier New"/>
-                <w:sz w:val="17"/>
-              </w:rPr>
-              <w:t>umount /mnt</w:t>
-            </w:r>
-          </w:p>
-          <w:p>
-            <w:pPr>
-              <w:spacing w:before="0" w:after="0" w:line="240" w:lineRule="auto"/>
-            </w:pPr>
-            <w:r>
-              <w:rPr>
-                <w:rFonts w:ascii="Courier New" w:hAnsi="Courier New" w:eastAsia="Courier New"/>
-                <w:sz w:val="17"/>
-              </w:rPr>
-              <w:t>mkdir -p /exports/projects /exports/docs</w:t>
-            </w:r>
-          </w:p>
-          <w:p>
-            <w:pPr>
-              <w:spacing w:before="0" w:after="0" w:line="240" w:lineRule="auto"/>
-            </w:pPr>
-            <w:r>
-              <w:rPr>
-                <w:rFonts w:ascii="Courier New" w:hAnsi="Courier New" w:eastAsia="Courier New"/>
-                <w:sz w:val="17"/>
-              </w:rPr>
-              <w:t>echo 'Mock1 projects share' &gt; /exports/projects/README</w:t>
-            </w:r>
-          </w:p>
-          <w:p>
-            <w:pPr>
-              <w:spacing w:before="0" w:after="0" w:line="240" w:lineRule="auto"/>
-            </w:pPr>
-            <w:r>
-              <w:rPr>
-                <w:rFonts w:ascii="Courier New" w:hAnsi="Courier New" w:eastAsia="Courier New"/>
-                <w:sz w:val="17"/>
-              </w:rPr>
-              <w:t>echo 'Mock1 docs share'     &gt; /exports/docs/README</w:t>
-            </w:r>
-          </w:p>
-          <w:p>
-            <w:pPr>
-              <w:spacing w:before="0" w:after="0" w:line="240" w:lineRule="auto"/>
-            </w:pPr>
-            <w:r>
-              <w:rPr>
-                <w:rFonts w:ascii="Courier New" w:hAnsi="Courier New" w:eastAsia="Courier New"/>
-                <w:sz w:val="17"/>
-              </w:rPr>
-              <w:t>printf '%s\n' '/exports/projects *(rw,sync,no_root_squash)' '/exports/docs *(rw,sync,no_root_squash)' &gt; /etc/exports.d/mock.exports</w:t>
-            </w:r>
-          </w:p>
-          <w:p>
-            <w:pPr>
-              <w:spacing w:before="0" w:after="0" w:line="240" w:lineRule="auto"/>
-            </w:pPr>
-            <w:r>
-              <w:rPr>
-                <w:rFonts w:ascii="Courier New" w:hAnsi="Courier New" w:eastAsia="Courier New"/>
-                <w:sz w:val="17"/>
-              </w:rPr>
-              <w:t>systemctl enable --now nfs-server</w:t>
-            </w:r>
-          </w:p>
-          <w:p>
-            <w:pPr>
-              <w:spacing w:before="0" w:after="0" w:line="240" w:lineRule="auto"/>
-            </w:pPr>
-            <w:r>
-              <w:rPr>
-                <w:rFonts w:ascii="Courier New" w:hAnsi="Courier New" w:eastAsia="Courier New"/>
-                <w:sz w:val="17"/>
-              </w:rPr>
-              <w:t>firewall-cmd --permanent --add-service={nfs,mountd,rpc-bind} &amp;&amp; firewall-cmd --reload</w:t>
-            </w:r>
-          </w:p>
-          <w:p>
-            <w:pPr>
-              <w:spacing w:before="0" w:after="0" w:line="240" w:lineRule="auto"/>
-            </w:pPr>
-            <w:r>
-              <w:rPr>
-                <w:rFonts w:ascii="Courier New" w:hAnsi="Courier New" w:eastAsia="Courier New"/>
-                <w:sz w:val="17"/>
-              </w:rPr>
-              <w:t>echo "root:$(openssl rand -hex 16)" | chpasswd      # last: root's password is now unknown</w:t>
-            </w:r>
-          </w:p>
-        </w:tc>
-      </w:tr>
-    </w:tbl>
-    <w:p>
-      <w:pPr>
-        <w:spacing w:after="40"/>
-      </w:pPr>
     </w:p>
     <w:p>
       <w:pPr>
-        <w:spacing w:before="0" w:after="100"/>
-        <w:ind w:left="0"/>
+        <w:keepNext w:val="0"/>
+        <w:tabs>
+          <w:tab w:pos="605" w:val="left"/>
+        </w:tabs>
+        <w:spacing w:before="120" w:after="60"/>
+        <w:ind w:left="605" w:hanging="605"/>
       </w:pPr>
+      <w:r>
+        <w:rPr>
+          <w:b/>
+          <w:sz w:val="21"/>
+        </w:rPr>
+        <w:t>2.</w:t>
+        <w:tab/>
+      </w:r>
       <w:r>
         <w:rPr>
           <w:b w:val="0"/>
           <w:sz w:val="21"/>
         </w:rPr>
-        <w:t>On node1:</w:t>
+        <w:t>The RHEL 9 DVD ISO attached to both.</w:t>
       </w:r>
     </w:p>
-    <w:tbl>
-      <w:tblPr>
-        <w:tblW w:type="auto" w:w="0"/>
-        <w:tblLook w:firstColumn="1" w:firstRow="1" w:lastColumn="0" w:lastRow="0" w:noHBand="0" w:noVBand="1" w:val="04A0"/>
-        <w:tblBorders>
-          <w:top w:val="single" w:sz="4" w:space="0" w:color="D9D9D9"/>
-          <w:left w:val="single" w:sz="4" w:space="0" w:color="D9D9D9"/>
-          <w:bottom w:val="single" w:sz="4" w:space="0" w:color="D9D9D9"/>
-          <w:right w:val="single" w:sz="4" w:space="0" w:color="D9D9D9"/>
-          <w:insideH w:val="single" w:sz="4" w:space="0" w:color="D9D9D9"/>
-          <w:insideV w:val="single" w:sz="4" w:space="0" w:color="D9D9D9"/>
-        </w:tblBorders>
-        <w:tblW w:w="9604" w:type="dxa"/>
-        <w:tblLayout w:type="fixed"/>
-      </w:tblPr>
-      <w:tblGrid>
-        <w:gridCol w:w="9604"/>
-      </w:tblGrid>
-      <w:tr>
-        <w:trPr>
-          <w:cantSplit/>
-        </w:trPr>
-        <w:tc>
-          <w:tcPr>
-            <w:tcW w:type="dxa" w:w="9605"/>
-            <w:tcW w:w="9604" w:type="dxa"/>
-            <w:shd w:val="clear" w:color="auto" w:fill="F6F6F6"/>
-          </w:tcPr>
-          <w:p>
-            <w:pPr>
-              <w:spacing w:before="0" w:after="0" w:line="240" w:lineRule="auto"/>
-            </w:pPr>
-            <w:r>
-              <w:rPr>
-                <w:rFonts w:ascii="Courier New" w:hAnsi="Courier New" w:eastAsia="Courier New"/>
-                <w:sz w:val="17"/>
-              </w:rPr>
-              <w:t>hostnamectl set-hostname node1</w:t>
-            </w:r>
-          </w:p>
-          <w:p>
-            <w:pPr>
-              <w:spacing w:before="0" w:after="0" w:line="240" w:lineRule="auto"/>
-            </w:pPr>
-            <w:r>
-              <w:rPr>
-                <w:rFonts w:ascii="Courier New" w:hAnsi="Courier New" w:eastAsia="Courier New"/>
-                <w:sz w:val="17"/>
-              </w:rPr>
-              <w:t>rm -f /etc/yum.repos.d/*.repo</w:t>
-            </w:r>
-          </w:p>
-          <w:p>
-            <w:pPr>
-              <w:spacing w:before="0" w:after="0" w:line="240" w:lineRule="auto"/>
-            </w:pPr>
-            <w:r>
-              <w:rPr>
-                <w:rFonts w:ascii="Courier New" w:hAnsi="Courier New" w:eastAsia="Courier New"/>
-                <w:sz w:val="17"/>
-              </w:rPr>
-              <w:t>sed -i 's/^SELINUX=.*/SELINUX=permissive/' /etc/selinux/config &amp;&amp; setenforce 0</w:t>
-            </w:r>
-          </w:p>
-          <w:p>
-            <w:pPr>
-              <w:spacing w:before="0" w:after="0" w:line="240" w:lineRule="auto"/>
-            </w:pPr>
-            <w:r>
-              <w:rPr>
-                <w:rFonts w:ascii="Courier New" w:hAnsi="Courier New" w:eastAsia="Courier New"/>
-                <w:sz w:val="17"/>
-              </w:rPr>
-              <w:t>rm -rf /var/log/journal</w:t>
-            </w:r>
-          </w:p>
-          <w:p>
-            <w:pPr>
-              <w:spacing w:before="0" w:after="0" w:line="240" w:lineRule="auto"/>
-            </w:pPr>
-            <w:r>
-              <w:rPr>
-                <w:rFonts w:ascii="Courier New" w:hAnsi="Courier New" w:eastAsia="Courier New"/>
-                <w:sz w:val="17"/>
-              </w:rPr>
-              <w:t>echo "root:$(openssl rand -hex 16)" | chpasswd      # last: root's password is now unknown</w:t>
-            </w:r>
-          </w:p>
-        </w:tc>
-      </w:tr>
-    </w:tbl>
     <w:p>
       <w:pPr>
-        <w:spacing w:after="40"/>
+        <w:keepNext w:val="0"/>
+        <w:tabs>
+          <w:tab w:pos="605" w:val="left"/>
+        </w:tabs>
+        <w:spacing w:before="120" w:after="60"/>
+        <w:ind w:left="605" w:hanging="605"/>
       </w:pPr>
+      <w:r>
+        <w:rPr>
+          <w:b/>
+          <w:sz w:val="21"/>
+        </w:rPr>
+        <w:t>3.</w:t>
+        <w:tab/>
+      </w:r>
+      <w:r>
+        <w:rPr>
+          <w:b w:val="0"/>
+          <w:sz w:val="21"/>
+        </w:rPr>
+        <w:t>node1 has three empty spare disks and internet access.</w:t>
+      </w:r>
+    </w:p>
+    <w:p>
+      <w:pPr>
+        <w:keepNext w:val="0"/>
+        <w:tabs>
+          <w:tab w:pos="605" w:val="left"/>
+        </w:tabs>
+        <w:spacing w:before="120" w:after="60"/>
+        <w:ind w:left="605" w:hanging="605"/>
+      </w:pPr>
+      <w:r>
+        <w:rPr>
+          <w:b/>
+          <w:sz w:val="21"/>
+        </w:rPr>
+        <w:t>4.</w:t>
+        <w:tab/>
+      </w:r>
+      <w:r>
+        <w:rPr>
+          <w:b w:val="0"/>
+          <w:sz w:val="21"/>
+        </w:rPr>
+        <w:t>A snapshot of both, so you can retake the exam.</w:t>
+      </w:r>
     </w:p>
     <w:p>
       <w:pPr>
@@ -1110,7 +886,7 @@
           <w:b w:val="0"/>
           <w:sz w:val="21"/>
         </w:rPr>
-        <w:t xml:space="preserve"> repository to the mounted ISO's BaseOS.</w:t>
+        <w:t xml:space="preserve"> repository to the mounted ISO's BaseOS. The mount must persist across boots.</w:t>
       </w:r>
     </w:p>
     <w:p>
@@ -1128,6 +904,253 @@
           <w:sz w:val="21"/>
         </w:rPr>
         <w:t>4.</w:t>
+        <w:tab/>
+      </w:r>
+      <w:r>
+        <w:rPr>
+          <w:b/>
+          <w:sz w:val="21"/>
+        </w:rPr>
+        <w:t>On node2:</w:t>
+      </w:r>
+      <w:r>
+        <w:rPr>
+          <w:b w:val="0"/>
+          <w:sz w:val="21"/>
+        </w:rPr>
+        <w:t xml:space="preserve"> mount the ISO persistently at </w:t>
+      </w:r>
+      <w:r>
+        <w:rPr>
+          <w:rFonts w:ascii="Courier New" w:hAnsi="Courier New" w:eastAsia="Courier New"/>
+          <w:b w:val="0"/>
+          <w:color w:val="C2560B"/>
+          <w:sz w:val="19"/>
+        </w:rPr>
+        <w:t>/mnt/rhel9-iso</w:t>
+      </w:r>
+      <w:r>
+        <w:rPr>
+          <w:b w:val="0"/>
+          <w:sz w:val="21"/>
+        </w:rPr>
+        <w:t>, and configure node2 to install packages from it.</w:t>
+      </w:r>
+    </w:p>
+    <w:p>
+      <w:pPr>
+        <w:keepNext w:val="0"/>
+        <w:tabs>
+          <w:tab w:pos="605" w:val="left"/>
+        </w:tabs>
+        <w:spacing w:before="120" w:after="60"/>
+        <w:ind w:left="605" w:hanging="605"/>
+      </w:pPr>
+      <w:r>
+        <w:rPr>
+          <w:b/>
+          <w:sz w:val="21"/>
+        </w:rPr>
+        <w:t>5.</w:t>
+        <w:tab/>
+      </w:r>
+      <w:r>
+        <w:rPr>
+          <w:b/>
+          <w:sz w:val="21"/>
+        </w:rPr>
+        <w:t>On node2:</w:t>
+      </w:r>
+      <w:r>
+        <w:rPr>
+          <w:b w:val="0"/>
+          <w:sz w:val="21"/>
+        </w:rPr>
+        <w:t xml:space="preserve"> configure node2 as an NFS server.</w:t>
+      </w:r>
+    </w:p>
+    <w:p>
+      <w:pPr>
+        <w:spacing w:before="0" w:after="60"/>
+        <w:ind w:left="965" w:hanging="259"/>
+      </w:pPr>
+      <w:r>
+        <w:rPr>
+          <w:sz w:val="21"/>
+        </w:rPr>
+        <w:t xml:space="preserve">•  </w:t>
+      </w:r>
+      <w:r>
+        <w:rPr>
+          <w:b w:val="0"/>
+          <w:sz w:val="21"/>
+        </w:rPr>
+        <w:t xml:space="preserve">Export </w:t>
+      </w:r>
+      <w:r>
+        <w:rPr>
+          <w:rFonts w:ascii="Courier New" w:hAnsi="Courier New" w:eastAsia="Courier New"/>
+          <w:b w:val="0"/>
+          <w:color w:val="C2560B"/>
+          <w:sz w:val="19"/>
+        </w:rPr>
+        <w:t>/exports/projects</w:t>
+      </w:r>
+      <w:r>
+        <w:rPr>
+          <w:b w:val="0"/>
+          <w:sz w:val="21"/>
+        </w:rPr>
+        <w:t xml:space="preserve"> and </w:t>
+      </w:r>
+      <w:r>
+        <w:rPr>
+          <w:rFonts w:ascii="Courier New" w:hAnsi="Courier New" w:eastAsia="Courier New"/>
+          <w:b w:val="0"/>
+          <w:color w:val="C2560B"/>
+          <w:sz w:val="19"/>
+        </w:rPr>
+        <w:t>/exports/docs</w:t>
+      </w:r>
+      <w:r>
+        <w:rPr>
+          <w:b w:val="0"/>
+          <w:sz w:val="21"/>
+        </w:rPr>
+        <w:t xml:space="preserve">, both </w:t>
+      </w:r>
+      <w:r>
+        <w:rPr>
+          <w:b/>
+          <w:sz w:val="21"/>
+        </w:rPr>
+        <w:t>read-write</w:t>
+      </w:r>
+      <w:r>
+        <w:rPr>
+          <w:b w:val="0"/>
+          <w:sz w:val="21"/>
+        </w:rPr>
+        <w:t>, to node1.</w:t>
+      </w:r>
+    </w:p>
+    <w:p>
+      <w:pPr>
+        <w:spacing w:before="0" w:after="60"/>
+        <w:ind w:left="965" w:hanging="259"/>
+      </w:pPr>
+      <w:r>
+        <w:rPr>
+          <w:sz w:val="21"/>
+        </w:rPr>
+        <w:t xml:space="preserve">•  </w:t>
+      </w:r>
+      <w:r>
+        <w:rPr>
+          <w:b w:val="0"/>
+          <w:sz w:val="21"/>
+        </w:rPr>
+        <w:t xml:space="preserve">Create </w:t>
+      </w:r>
+      <w:r>
+        <w:rPr>
+          <w:rFonts w:ascii="Courier New" w:hAnsi="Courier New" w:eastAsia="Courier New"/>
+          <w:b w:val="0"/>
+          <w:color w:val="C2560B"/>
+          <w:sz w:val="19"/>
+        </w:rPr>
+        <w:t>/exports/projects/README</w:t>
+      </w:r>
+      <w:r>
+        <w:rPr>
+          <w:b w:val="0"/>
+          <w:sz w:val="21"/>
+        </w:rPr>
+        <w:t xml:space="preserve"> containing exactly </w:t>
+      </w:r>
+      <w:r>
+        <w:rPr>
+          <w:rFonts w:ascii="Courier New" w:hAnsi="Courier New" w:eastAsia="Courier New"/>
+          <w:b w:val="0"/>
+          <w:color w:val="C2560B"/>
+          <w:sz w:val="19"/>
+        </w:rPr>
+        <w:t>Mock1 projects share</w:t>
+      </w:r>
+      <w:r>
+        <w:rPr>
+          <w:b w:val="0"/>
+          <w:sz w:val="21"/>
+        </w:rPr>
+        <w:t xml:space="preserve">, and </w:t>
+      </w:r>
+      <w:r>
+        <w:rPr>
+          <w:rFonts w:ascii="Courier New" w:hAnsi="Courier New" w:eastAsia="Courier New"/>
+          <w:b w:val="0"/>
+          <w:color w:val="C2560B"/>
+          <w:sz w:val="19"/>
+        </w:rPr>
+        <w:t>/exports/docs/README</w:t>
+      </w:r>
+      <w:r>
+        <w:rPr>
+          <w:b w:val="0"/>
+          <w:sz w:val="21"/>
+        </w:rPr>
+        <w:t xml:space="preserve"> containing exactly </w:t>
+      </w:r>
+      <w:r>
+        <w:rPr>
+          <w:rFonts w:ascii="Courier New" w:hAnsi="Courier New" w:eastAsia="Courier New"/>
+          <w:b w:val="0"/>
+          <w:color w:val="C2560B"/>
+          <w:sz w:val="19"/>
+        </w:rPr>
+        <w:t>Mock1 docs share</w:t>
+      </w:r>
+      <w:r>
+        <w:rPr>
+          <w:b w:val="0"/>
+          <w:sz w:val="21"/>
+        </w:rPr>
+        <w:t>.</w:t>
+      </w:r>
+    </w:p>
+    <w:p>
+      <w:pPr>
+        <w:spacing w:before="0" w:after="60"/>
+        <w:ind w:left="965" w:hanging="259"/>
+      </w:pPr>
+      <w:r>
+        <w:rPr>
+          <w:sz w:val="21"/>
+        </w:rPr>
+        <w:t xml:space="preserve">•  </w:t>
+      </w:r>
+      <w:r>
+        <w:rPr>
+          <w:b w:val="0"/>
+          <w:sz w:val="21"/>
+        </w:rPr>
+        <w:t>The NFS service must start at boot, and node1 must be able to reach it through node2's firewall, persistently.</w:t>
+      </w:r>
+    </w:p>
+    <w:p>
+      <w:pPr>
+        <w:keepNext w:val="0"/>
+        <w:tabs>
+          <w:tab w:pos="605" w:val="left"/>
+        </w:tabs>
+        <w:spacing w:before="120" w:after="60"/>
+        <w:ind w:left="605" w:hanging="605"/>
+      </w:pPr>
+      <w:r>
+        <w:rPr>
+          <w:b/>
+          <w:sz w:val="21"/>
+        </w:rPr>
+        <w:t>6.</w:t>
         <w:tab/>
       </w:r>
       <w:r>
@@ -1242,7 +1265,7 @@
           <w:b/>
           <w:sz w:val="21"/>
         </w:rPr>
-        <w:t>5.</w:t>
+        <w:t>7.</w:t>
         <w:tab/>
       </w:r>
       <w:r>
@@ -1314,7 +1337,7 @@
           <w:b w:val="0"/>
           <w:sz w:val="21"/>
         </w:rPr>
-        <w:t>. The home directory must be under the XFS file system from task 4.</w:t>
+        <w:t>. The home directory must be under the XFS file system from task 6.</w:t>
       </w:r>
     </w:p>
     <w:p>
@@ -1331,7 +1354,7 @@
           <w:b/>
           <w:sz w:val="21"/>
         </w:rPr>
-        <w:t>6.</w:t>
+        <w:t>8.</w:t>
         <w:tab/>
       </w:r>
       <w:r>
@@ -1418,7 +1441,7 @@
           <w:b/>
           <w:sz w:val="21"/>
         </w:rPr>
-        <w:t>7.</w:t>
+        <w:t>9.</w:t>
         <w:tab/>
       </w:r>
       <w:r>
@@ -1491,7 +1514,7 @@
           <w:b/>
           <w:sz w:val="21"/>
         </w:rPr>
-        <w:t>8.</w:t>
+        <w:t>10.</w:t>
         <w:tab/>
       </w:r>
       <w:r>
@@ -1578,7 +1601,7 @@
           <w:b/>
           <w:sz w:val="21"/>
         </w:rPr>
-        <w:t>9.</w:t>
+        <w:t>11.</w:t>
         <w:tab/>
       </w:r>
       <w:r>
@@ -1802,7 +1825,7 @@
           <w:b/>
           <w:sz w:val="21"/>
         </w:rPr>
-        <w:t>10.</w:t>
+        <w:t>12.</w:t>
         <w:tab/>
       </w:r>
       <w:r>
@@ -1841,7 +1864,7 @@
           <w:b/>
           <w:sz w:val="21"/>
         </w:rPr>
-        <w:t>11.</w:t>
+        <w:t>13.</w:t>
         <w:tab/>
       </w:r>
       <w:r>
@@ -1896,7 +1919,7 @@
           <w:b/>
           <w:sz w:val="21"/>
         </w:rPr>
-        <w:t>12.</w:t>
+        <w:t>14.</w:t>
         <w:tab/>
       </w:r>
       <w:r>
@@ -1921,7 +1944,7 @@
           <w:b/>
           <w:sz w:val="21"/>
         </w:rPr>
-        <w:t>13.</w:t>
+        <w:t>15.</w:t>
         <w:tab/>
       </w:r>
       <w:r>
@@ -2098,7 +2121,7 @@
           <w:b/>
           <w:sz w:val="21"/>
         </w:rPr>
-        <w:t>14.</w:t>
+        <w:t>16.</w:t>
         <w:tab/>
       </w:r>
       <w:r>
@@ -2169,7 +2192,7 @@
           <w:b/>
           <w:sz w:val="21"/>
         </w:rPr>
-        <w:t>15.</w:t>
+        <w:t>17.</w:t>
         <w:tab/>
       </w:r>
       <w:r>
@@ -2258,7 +2281,7 @@
           <w:b/>
           <w:sz w:val="21"/>
         </w:rPr>
-        <w:t>16.</w:t>
+        <w:t>18.</w:t>
         <w:tab/>
       </w:r>
       <w:r>
@@ -2328,7 +2351,7 @@
           <w:b w:val="0"/>
           <w:sz w:val="21"/>
         </w:rPr>
-        <w:t xml:space="preserve"> using key-based authentication, with no password prompt. Set up the key before you do task 17.</w:t>
+        <w:t xml:space="preserve"> using key-based authentication, with no password prompt. Set up the key before you do task 19.</w:t>
       </w:r>
     </w:p>
     <w:p>
@@ -2345,7 +2368,7 @@
           <w:b/>
           <w:sz w:val="21"/>
         </w:rPr>
-        <w:t>17.</w:t>
+        <w:t>19.</w:t>
         <w:tab/>
       </w:r>
       <w:r>
@@ -2424,7 +2447,7 @@
           <w:b/>
           <w:sz w:val="21"/>
         </w:rPr>
-        <w:t>18.</w:t>
+        <w:t>20.</w:t>
         <w:tab/>
       </w:r>
       <w:r>
@@ -2432,39 +2455,7 @@
           <w:b w:val="0"/>
           <w:sz w:val="21"/>
         </w:rPr>
-        <w:t xml:space="preserve">The NFS server on node2 is already configured and exports </w:t>
-      </w:r>
-      <w:r>
-        <w:rPr>
-          <w:rFonts w:ascii="Courier New" w:hAnsi="Courier New" w:eastAsia="Courier New"/>
-          <w:b w:val="0"/>
-          <w:color w:val="C2560B"/>
-          <w:sz w:val="19"/>
-        </w:rPr>
-        <w:t>/exports/projects</w:t>
-      </w:r>
-      <w:r>
-        <w:rPr>
-          <w:b w:val="0"/>
-          <w:sz w:val="21"/>
-        </w:rPr>
-        <w:t xml:space="preserve"> and </w:t>
-      </w:r>
-      <w:r>
-        <w:rPr>
-          <w:rFonts w:ascii="Courier New" w:hAnsi="Courier New" w:eastAsia="Courier New"/>
-          <w:b w:val="0"/>
-          <w:color w:val="C2560B"/>
-          <w:sz w:val="19"/>
-        </w:rPr>
-        <w:t>/exports/docs</w:t>
-      </w:r>
-      <w:r>
-        <w:rPr>
-          <w:b w:val="0"/>
-          <w:sz w:val="21"/>
-        </w:rPr>
-        <w:t>. Configure autofs so that both shares mount automatically on demand:</w:t>
+        <w:t>Using the NFS server from task 5, configure autofs on node1 so that both shares mount automatically on demand:</w:t>
       </w:r>
     </w:p>
     <w:p>
@@ -2671,7 +2662,7 @@
                 <w:rFonts w:ascii="Courier New" w:hAnsi="Courier New" w:eastAsia="Courier New"/>
                 <w:sz w:val="17"/>
               </w:rPr>
-              <w:t>bash rhcsa9-mock-1-grade.sh          # on node1, then copy it to node2 and run it there too</w:t>
+              <w:t>bash rhcsa9-mock-1-grade.sh          # on node1, then on node2</w:t>
             </w:r>
           </w:p>
           <w:p>

</xml_diff>

<commit_message>
Standalone mocks: clearer tasks, extra practice, setup and grading appendices
- Every task names its node, and states what is needed to do and grade
  it: fixed container users (chef, barista), container port and docroot,
  passwords, export targets, any map type, gpgcheck=0.
- Mock 1 variations at the same difficulty: sudo for tail /var/log/secure,
  a script writing free -h, a 1 GiB swap partition.
- Six extra tasks per mock: /etc/hosts on both nodes, hostname, tar, grep
  and tuned (Mock 1); hosts aliases used by the SSH and autofs tasks,
  chrony server and client, an SELinux boolean, login.defs (Mock 2).
- Papers are self-contained: Appendix A builds the lab, B gets the grader
  into the VMs, C grades and works out the combined score.
- Graders stop with a clear message when the IPs match neither node,
  print the tasks passed, and carry a usage note.
- .gitattributes keeps .sh files LF on Windows checkouts.

Co-Authored-By: Claude Opus 5.5 <noreply@anthropic.com>
</commit_message>
<xml_diff>
--- a/exams/ph2026b2/mock-1/RHCSA9_Mock_Exam_1.docx
+++ b/exams/ph2026b2/mock-1/RHCSA9_Mock_Exam_1.docx
@@ -29,14 +29,14 @@
           <w:b w:val="0"/>
           <w:sz w:val="21"/>
         </w:rPr>
-        <w:t xml:space="preserve">Every task follows PH2026B2 Practical Exams 1–3, with different names and values. Not a full EX200 paper. </w:t>
+        <w:t xml:space="preserve">Tasks 1–20 follow PH2026B2 Practical Exams 1–3, with different names, values and commands; tasks 21–26 are small extras from the RHCSA objectives. Not a full EX200 paper. </w:t>
       </w:r>
       <w:r>
         <w:rPr>
           <w:b/>
           <w:sz w:val="21"/>
         </w:rPr>
-        <w:t>Time: 170 minutes.</w:t>
+        <w:t>Time: 195 minutes.</w:t>
       </w:r>
       <w:r>
         <w:rPr>
@@ -249,7 +249,7 @@
                 <w:b w:val="0"/>
                 <w:sz w:val="19"/>
               </w:rPr>
-              <w:t xml:space="preserve"> (any size, 1 GiB or more).</w:t>
+              <w:t xml:space="preserve"> (2 GiB or more). Internet access for the container image.</w:t>
             </w:r>
           </w:p>
         </w:tc>
@@ -400,7 +400,23 @@
           <w:b w:val="0"/>
           <w:sz w:val="21"/>
         </w:rPr>
-        <w:t>The RHEL 9 DVD ISO is attached to the optical drive of both VMs. Neither node has repositories configured.</w:t>
+        <w:t xml:space="preserve">The RHEL 9 DVD ISO is attached to the optical drive of both VMs. Neither node has repositories configured. Use </w:t>
+      </w:r>
+      <w:r>
+        <w:rPr>
+          <w:rFonts w:ascii="Courier New" w:hAnsi="Courier New" w:eastAsia="Courier New"/>
+          <w:b w:val="0"/>
+          <w:color w:val="C2560B"/>
+          <w:sz w:val="19"/>
+        </w:rPr>
+        <w:t>gpgcheck=0</w:t>
+      </w:r>
+      <w:r>
+        <w:rPr>
+          <w:b w:val="0"/>
+          <w:sz w:val="21"/>
+        </w:rPr>
+        <w:t xml:space="preserve"> for every repository.</w:t>
       </w:r>
     </w:p>
     <w:p>
@@ -438,21 +454,7 @@
           <w:b w:val="0"/>
           <w:sz w:val="21"/>
         </w:rPr>
-        <w:t xml:space="preserve">Unless a task names a node, do it on </w:t>
-      </w:r>
-      <w:r>
-        <w:rPr>
-          <w:b/>
-          <w:sz w:val="21"/>
-        </w:rPr>
-        <w:t>node1</w:t>
-      </w:r>
-      <w:r>
-        <w:rPr>
-          <w:b w:val="0"/>
-          <w:sz w:val="21"/>
-        </w:rPr>
-        <w:t>.</w:t>
+        <w:t>Each task starts with the node it runs on.</w:t>
       </w:r>
     </w:p>
     <w:p>
@@ -582,7 +584,21 @@
           <w:b w:val="0"/>
           <w:sz w:val="21"/>
         </w:rPr>
-        <w:t>No commands to type. Check the lab is ready:</w:t>
+        <w:t xml:space="preserve">No commands to type. If you haven't built the lab yet, follow </w:t>
+      </w:r>
+      <w:r>
+        <w:rPr>
+          <w:b/>
+          <w:sz w:val="21"/>
+        </w:rPr>
+        <w:t>Appendix A</w:t>
+      </w:r>
+      <w:r>
+        <w:rPr>
+          <w:b w:val="0"/>
+          <w:sz w:val="21"/>
+        </w:rPr>
+        <w:t xml:space="preserve"> at the end of this paper (about 30 minutes, once). Then check:</w:t>
       </w:r>
     </w:p>
     <w:p>
@@ -685,7 +701,23 @@
           <w:b w:val="0"/>
           <w:sz w:val="21"/>
         </w:rPr>
-        <w:t>node1 has three empty spare disks and internet access.</w:t>
+        <w:t xml:space="preserve">node1 has three empty spare disks, and can reach the internet: </w:t>
+      </w:r>
+      <w:r>
+        <w:rPr>
+          <w:rFonts w:ascii="Courier New" w:hAnsi="Courier New" w:eastAsia="Courier New"/>
+          <w:b w:val="0"/>
+          <w:color w:val="C2560B"/>
+          <w:sz w:val="19"/>
+        </w:rPr>
+        <w:t>ping -c2 8.8.8.8 &amp;&amp; getent hosts registry.access.redhat.com</w:t>
+      </w:r>
+      <w:r>
+        <w:rPr>
+          <w:b w:val="0"/>
+          <w:sz w:val="21"/>
+        </w:rPr>
+        <w:t xml:space="preserve"> must succeed.</w:t>
       </w:r>
     </w:p>
     <w:p>
@@ -703,6 +735,47 @@
           <w:sz w:val="21"/>
         </w:rPr>
         <w:t>4.</w:t>
+        <w:tab/>
+      </w:r>
+      <w:r>
+        <w:rPr>
+          <w:b w:val="0"/>
+          <w:sz w:val="21"/>
+        </w:rPr>
+        <w:t xml:space="preserve">The grader is at </w:t>
+      </w:r>
+      <w:r>
+        <w:rPr>
+          <w:rFonts w:ascii="Courier New" w:hAnsi="Courier New" w:eastAsia="Courier New"/>
+          <w:b w:val="0"/>
+          <w:color w:val="C2560B"/>
+          <w:sz w:val="19"/>
+        </w:rPr>
+        <w:t>/root/grade.sh</w:t>
+      </w:r>
+      <w:r>
+        <w:rPr>
+          <w:b w:val="0"/>
+          <w:sz w:val="21"/>
+        </w:rPr>
+        <w:t xml:space="preserve"> on both VMs (Appendix B).</w:t>
+      </w:r>
+    </w:p>
+    <w:p>
+      <w:pPr>
+        <w:keepNext w:val="0"/>
+        <w:tabs>
+          <w:tab w:pos="605" w:val="left"/>
+        </w:tabs>
+        <w:spacing w:before="120" w:after="60"/>
+        <w:ind w:left="605" w:hanging="605"/>
+      </w:pPr>
+      <w:r>
+        <w:rPr>
+          <w:b/>
+          <w:sz w:val="21"/>
+        </w:rPr>
+        <w:t>5.</w:t>
         <w:tab/>
       </w:r>
       <w:r>
@@ -853,10 +926,17 @@
       </w:r>
       <w:r>
         <w:rPr>
-          <w:b w:val="0"/>
-          <w:sz w:val="21"/>
-        </w:rPr>
-        <w:t xml:space="preserve">There are no repositories available in the operating system, but the RHEL 9 ISO is attached. Mount the ISO at </w:t>
+          <w:b/>
+          <w:sz w:val="21"/>
+        </w:rPr>
+        <w:t>On node1:</w:t>
+      </w:r>
+      <w:r>
+        <w:rPr>
+          <w:b w:val="0"/>
+          <w:sz w:val="21"/>
+        </w:rPr>
+        <w:t xml:space="preserve"> there are no repositories available in the operating system, but the RHEL 9 ISO is attached. Mount the ISO at </w:t>
       </w:r>
       <w:r>
         <w:rPr>
@@ -872,7 +952,7 @@
           <w:b w:val="0"/>
           <w:sz w:val="21"/>
         </w:rPr>
-        <w:t xml:space="preserve">, and set up the </w:t>
+        <w:t xml:space="preserve">, persistently. Set up two repositories from the mounted ISO: </w:t>
       </w:r>
       <w:r>
         <w:rPr>
@@ -886,7 +966,21 @@
           <w:b w:val="0"/>
           <w:sz w:val="21"/>
         </w:rPr>
-        <w:t xml:space="preserve"> repository to the mounted ISO's BaseOS. The mount must persist across boots.</w:t>
+        <w:t xml:space="preserve"> and </w:t>
+      </w:r>
+      <w:r>
+        <w:rPr>
+          <w:b/>
+          <w:sz w:val="21"/>
+        </w:rPr>
+        <w:t>AppStream</w:t>
+      </w:r>
+      <w:r>
+        <w:rPr>
+          <w:b w:val="0"/>
+          <w:sz w:val="21"/>
+        </w:rPr>
+        <w:t>. Later tasks install packages from both.</w:t>
       </w:r>
     </w:p>
     <w:p>
@@ -918,7 +1012,7 @@
           <w:b w:val="0"/>
           <w:sz w:val="21"/>
         </w:rPr>
-        <w:t xml:space="preserve"> mount the ISO persistently at </w:t>
+        <w:t xml:space="preserve"> mount the ISO at </w:t>
       </w:r>
       <w:r>
         <w:rPr>
@@ -934,7 +1028,21 @@
           <w:b w:val="0"/>
           <w:sz w:val="21"/>
         </w:rPr>
-        <w:t>, and configure node2 to install packages from it.</w:t>
+        <w:t xml:space="preserve">, persistently, and set up the </w:t>
+      </w:r>
+      <w:r>
+        <w:rPr>
+          <w:b/>
+          <w:sz w:val="21"/>
+        </w:rPr>
+        <w:t>BaseOS</w:t>
+      </w:r>
+      <w:r>
+        <w:rPr>
+          <w:b w:val="0"/>
+          <w:sz w:val="21"/>
+        </w:rPr>
+        <w:t xml:space="preserve"> repository from it.</w:t>
       </w:r>
     </w:p>
     <w:p>
@@ -985,7 +1093,7 @@
           <w:b w:val="0"/>
           <w:sz w:val="21"/>
         </w:rPr>
-        <w:t xml:space="preserve">Export </w:t>
+        <w:t xml:space="preserve">Create </w:t>
       </w:r>
       <w:r>
         <w:rPr>
@@ -994,14 +1102,14 @@
           <w:color w:val="C2560B"/>
           <w:sz w:val="19"/>
         </w:rPr>
-        <w:t>/exports/projects</w:t>
-      </w:r>
-      <w:r>
-        <w:rPr>
-          <w:b w:val="0"/>
-          <w:sz w:val="21"/>
-        </w:rPr>
-        <w:t xml:space="preserve"> and </w:t>
+        <w:t>/exports/projects/README</w:t>
+      </w:r>
+      <w:r>
+        <w:rPr>
+          <w:b w:val="0"/>
+          <w:sz w:val="21"/>
+        </w:rPr>
+        <w:t xml:space="preserve"> containing exactly </w:t>
       </w:r>
       <w:r>
         <w:rPr>
@@ -1010,28 +1118,46 @@
           <w:color w:val="C2560B"/>
           <w:sz w:val="19"/>
         </w:rPr>
-        <w:t>/exports/docs</w:t>
-      </w:r>
-      <w:r>
-        <w:rPr>
-          <w:b w:val="0"/>
-          <w:sz w:val="21"/>
-        </w:rPr>
-        <w:t xml:space="preserve">, both </w:t>
-      </w:r>
-      <w:r>
-        <w:rPr>
-          <w:b/>
-          <w:sz w:val="21"/>
-        </w:rPr>
-        <w:t>read-write</w:t>
-      </w:r>
-      <w:r>
-        <w:rPr>
-          <w:b w:val="0"/>
-          <w:sz w:val="21"/>
-        </w:rPr>
-        <w:t>, to node1.</w:t>
+        <w:t>Mock1 projects share</w:t>
+      </w:r>
+      <w:r>
+        <w:rPr>
+          <w:b w:val="0"/>
+          <w:sz w:val="21"/>
+        </w:rPr>
+        <w:t xml:space="preserve">, and </w:t>
+      </w:r>
+      <w:r>
+        <w:rPr>
+          <w:rFonts w:ascii="Courier New" w:hAnsi="Courier New" w:eastAsia="Courier New"/>
+          <w:b w:val="0"/>
+          <w:color w:val="C2560B"/>
+          <w:sz w:val="19"/>
+        </w:rPr>
+        <w:t>/exports/docs/README</w:t>
+      </w:r>
+      <w:r>
+        <w:rPr>
+          <w:b w:val="0"/>
+          <w:sz w:val="21"/>
+        </w:rPr>
+        <w:t xml:space="preserve"> containing exactly </w:t>
+      </w:r>
+      <w:r>
+        <w:rPr>
+          <w:rFonts w:ascii="Courier New" w:hAnsi="Courier New" w:eastAsia="Courier New"/>
+          <w:b w:val="0"/>
+          <w:color w:val="C2560B"/>
+          <w:sz w:val="19"/>
+        </w:rPr>
+        <w:t>Mock1 docs share</w:t>
+      </w:r>
+      <w:r>
+        <w:rPr>
+          <w:b w:val="0"/>
+          <w:sz w:val="21"/>
+        </w:rPr>
+        <w:t>.</w:t>
       </w:r>
     </w:p>
     <w:p>
@@ -1050,7 +1176,7 @@
           <w:b w:val="0"/>
           <w:sz w:val="21"/>
         </w:rPr>
-        <w:t xml:space="preserve">Create </w:t>
+        <w:t xml:space="preserve">Export </w:t>
       </w:r>
       <w:r>
         <w:rPr>
@@ -1059,14 +1185,14 @@
           <w:color w:val="C2560B"/>
           <w:sz w:val="19"/>
         </w:rPr>
-        <w:t>/exports/projects/README</w:t>
-      </w:r>
-      <w:r>
-        <w:rPr>
-          <w:b w:val="0"/>
-          <w:sz w:val="21"/>
-        </w:rPr>
-        <w:t xml:space="preserve"> containing exactly </w:t>
+        <w:t>/exports/projects</w:t>
+      </w:r>
+      <w:r>
+        <w:rPr>
+          <w:b w:val="0"/>
+          <w:sz w:val="21"/>
+        </w:rPr>
+        <w:t xml:space="preserve"> and </w:t>
       </w:r>
       <w:r>
         <w:rPr>
@@ -1075,14 +1201,28 @@
           <w:color w:val="C2560B"/>
           <w:sz w:val="19"/>
         </w:rPr>
-        <w:t>Mock1 projects share</w:t>
-      </w:r>
-      <w:r>
-        <w:rPr>
-          <w:b w:val="0"/>
-          <w:sz w:val="21"/>
-        </w:rPr>
-        <w:t xml:space="preserve">, and </w:t>
+        <w:t>/exports/docs</w:t>
+      </w:r>
+      <w:r>
+        <w:rPr>
+          <w:b w:val="0"/>
+          <w:sz w:val="21"/>
+        </w:rPr>
+        <w:t xml:space="preserve">, both </w:t>
+      </w:r>
+      <w:r>
+        <w:rPr>
+          <w:b/>
+          <w:sz w:val="21"/>
+        </w:rPr>
+        <w:t>read-write</w:t>
+      </w:r>
+      <w:r>
+        <w:rPr>
+          <w:b w:val="0"/>
+          <w:sz w:val="21"/>
+        </w:rPr>
+        <w:t xml:space="preserve">. node1 must be able to mount them; you may export to node1's IP address, your lab subnet or </w:t>
       </w:r>
       <w:r>
         <w:rPr>
@@ -1091,23 +1231,7 @@
           <w:color w:val="C2560B"/>
           <w:sz w:val="19"/>
         </w:rPr>
-        <w:t>/exports/docs/README</w:t>
-      </w:r>
-      <w:r>
-        <w:rPr>
-          <w:b w:val="0"/>
-          <w:sz w:val="21"/>
-        </w:rPr>
-        <w:t xml:space="preserve"> containing exactly </w:t>
-      </w:r>
-      <w:r>
-        <w:rPr>
-          <w:rFonts w:ascii="Courier New" w:hAnsi="Courier New" w:eastAsia="Courier New"/>
-          <w:b w:val="0"/>
-          <w:color w:val="C2560B"/>
-          <w:sz w:val="19"/>
-        </w:rPr>
-        <w:t>Mock1 docs share</w:t>
+        <w:t>*</w:t>
       </w:r>
       <w:r>
         <w:rPr>
@@ -1133,7 +1257,7 @@
           <w:b w:val="0"/>
           <w:sz w:val="21"/>
         </w:rPr>
-        <w:t>The NFS service must start at boot, and node1 must be able to reach it through node2's firewall, persistently.</w:t>
+        <w:t>The NFS server must start at boot, and node2's firewall must allow NFS, persistently.</w:t>
       </w:r>
     </w:p>
     <w:p>
@@ -1155,10 +1279,17 @@
       </w:r>
       <w:r>
         <w:rPr>
-          <w:b w:val="0"/>
-          <w:sz w:val="21"/>
-        </w:rPr>
-        <w:t xml:space="preserve">A clean, unformatted 5 GiB disk </w:t>
+          <w:b/>
+          <w:sz w:val="21"/>
+        </w:rPr>
+        <w:t>On node1:</w:t>
+      </w:r>
+      <w:r>
+        <w:rPr>
+          <w:b w:val="0"/>
+          <w:sz w:val="21"/>
+        </w:rPr>
+        <w:t xml:space="preserve"> a clean, unformatted 5 GiB disk </w:t>
       </w:r>
       <w:r>
         <w:rPr>
@@ -1188,7 +1319,7 @@
           <w:b w:val="0"/>
           <w:sz w:val="21"/>
         </w:rPr>
-        <w:t xml:space="preserve"> disk with two partitions of 2 GiB each. Make one partition's file system </w:t>
+        <w:t xml:space="preserve"> disk with two partitions of 2 GiB each, in either order. Make one partition's file system </w:t>
       </w:r>
       <w:r>
         <w:rPr>
@@ -1270,10 +1401,17 @@
       </w:r>
       <w:r>
         <w:rPr>
-          <w:b w:val="0"/>
-          <w:sz w:val="21"/>
-        </w:rPr>
-        <w:t xml:space="preserve">Create a user named </w:t>
+          <w:b/>
+          <w:sz w:val="21"/>
+        </w:rPr>
+        <w:t>On node1:</w:t>
+      </w:r>
+      <w:r>
+        <w:rPr>
+          <w:b w:val="0"/>
+          <w:sz w:val="21"/>
+        </w:rPr>
+        <w:t xml:space="preserve"> create a group </w:t>
       </w:r>
       <w:r>
         <w:rPr>
@@ -1282,14 +1420,14 @@
           <w:color w:val="C2560B"/>
           <w:sz w:val="19"/>
         </w:rPr>
-        <w:t>biscuit</w:t>
-      </w:r>
-      <w:r>
-        <w:rPr>
-          <w:b w:val="0"/>
-          <w:sz w:val="21"/>
-        </w:rPr>
-        <w:t xml:space="preserve">. </w:t>
+        <w:t>tin</w:t>
+      </w:r>
+      <w:r>
+        <w:rPr>
+          <w:b w:val="0"/>
+          <w:sz w:val="21"/>
+        </w:rPr>
+        <w:t xml:space="preserve"> and a user </w:t>
       </w:r>
       <w:r>
         <w:rPr>
@@ -1305,7 +1443,7 @@
           <w:b w:val="0"/>
           <w:sz w:val="21"/>
         </w:rPr>
-        <w:t xml:space="preserve"> must be in the group </w:t>
+        <w:t xml:space="preserve"> who is a member of </w:t>
       </w:r>
       <w:r>
         <w:rPr>
@@ -1321,7 +1459,7 @@
           <w:b w:val="0"/>
           <w:sz w:val="21"/>
         </w:rPr>
-        <w:t xml:space="preserve">. Set their home directory to </w:t>
+        <w:t xml:space="preserve">. Set biscuit's home directory to </w:t>
       </w:r>
       <w:r>
         <w:rPr>
@@ -1337,7 +1475,7 @@
           <w:b w:val="0"/>
           <w:sz w:val="21"/>
         </w:rPr>
-        <w:t>. The home directory must be under the XFS file system from task 6.</w:t>
+        <w:t>, on the XFS file system from task 6. biscuit must own the home directory.</w:t>
       </w:r>
     </w:p>
     <w:p>
@@ -1359,10 +1497,17 @@
       </w:r>
       <w:r>
         <w:rPr>
-          <w:b w:val="0"/>
-          <w:sz w:val="21"/>
-        </w:rPr>
-        <w:t xml:space="preserve">Members of the group </w:t>
+          <w:b/>
+          <w:sz w:val="21"/>
+        </w:rPr>
+        <w:t>On node1:</w:t>
+      </w:r>
+      <w:r>
+        <w:rPr>
+          <w:b w:val="0"/>
+          <w:sz w:val="21"/>
+        </w:rPr>
+        <w:t xml:space="preserve"> members of the group </w:t>
       </w:r>
       <w:r>
         <w:rPr>
@@ -1417,14 +1562,14 @@
           <w:color w:val="C2560B"/>
           <w:sz w:val="19"/>
         </w:rPr>
-        <w:t>sudo cat /var/log/messages</w:t>
-      </w:r>
-      <w:r>
-        <w:rPr>
-          <w:b w:val="0"/>
-          <w:sz w:val="21"/>
-        </w:rPr>
-        <w:t>.</w:t>
+        <w:t>sudo tail /var/log/secure</w:t>
+      </w:r>
+      <w:r>
+        <w:rPr>
+          <w:b w:val="0"/>
+          <w:sz w:val="21"/>
+        </w:rPr>
+        <w:t>. They are asked for their own password.</w:t>
       </w:r>
     </w:p>
     <w:p>
@@ -1446,10 +1591,17 @@
       </w:r>
       <w:r>
         <w:rPr>
-          <w:b w:val="0"/>
-          <w:sz w:val="21"/>
-        </w:rPr>
-        <w:t xml:space="preserve">A shared directory must exist at </w:t>
+          <w:b/>
+          <w:sz w:val="21"/>
+        </w:rPr>
+        <w:t>On node1:</w:t>
+      </w:r>
+      <w:r>
+        <w:rPr>
+          <w:b w:val="0"/>
+          <w:sz w:val="21"/>
+        </w:rPr>
+        <w:t xml:space="preserve"> a shared directory must exist at </w:t>
       </w:r>
       <w:r>
         <w:rPr>
@@ -1497,7 +1649,7 @@
           <w:b w:val="0"/>
           <w:sz w:val="21"/>
         </w:rPr>
-        <w:t xml:space="preserve"> must be able to create and read each other's files in it. Users must not be able to delete files that belong to other users.</w:t>
+        <w:t xml:space="preserve"> must be able to create and read each other's files in it. Users must not be able to delete files that belong to other users. There is no requirement for other users.</w:t>
       </w:r>
     </w:p>
     <w:p>
@@ -1519,10 +1671,17 @@
       </w:r>
       <w:r>
         <w:rPr>
-          <w:b w:val="0"/>
-          <w:sz w:val="21"/>
-        </w:rPr>
-        <w:t xml:space="preserve">Create a script named </w:t>
+          <w:b/>
+          <w:sz w:val="21"/>
+        </w:rPr>
+        <w:t>On node1:</w:t>
+      </w:r>
+      <w:r>
+        <w:rPr>
+          <w:b w:val="0"/>
+          <w:sz w:val="21"/>
+        </w:rPr>
+        <w:t xml:space="preserve"> create a script named </w:t>
       </w:r>
       <w:r>
         <w:rPr>
@@ -1531,7 +1690,7 @@
           <w:color w:val="C2560B"/>
           <w:sz w:val="19"/>
         </w:rPr>
-        <w:t>/root/load-report.sh</w:t>
+        <w:t>/root/mem-report.sh</w:t>
       </w:r>
       <w:r>
         <w:rPr>
@@ -1547,7 +1706,7 @@
           <w:color w:val="C2560B"/>
           <w:sz w:val="19"/>
         </w:rPr>
-        <w:t>uptime</w:t>
+        <w:t>free -h</w:t>
       </w:r>
       <w:r>
         <w:rPr>
@@ -1563,21 +1722,21 @@
           <w:color w:val="C2560B"/>
           <w:sz w:val="19"/>
         </w:rPr>
-        <w:t>/root/load.log</w:t>
-      </w:r>
-      <w:r>
-        <w:rPr>
-          <w:b w:val="0"/>
-          <w:sz w:val="21"/>
-        </w:rPr>
-        <w:t xml:space="preserve">. Schedule this script to run every day at </w:t>
+        <w:t>/root/memory.log</w:t>
+      </w:r>
+      <w:r>
+        <w:rPr>
+          <w:b w:val="0"/>
+          <w:sz w:val="21"/>
+        </w:rPr>
+        <w:t xml:space="preserve">, replacing the file's contents each time it runs. Schedule the script to run every day at </w:t>
       </w:r>
       <w:r>
         <w:rPr>
           <w:b/>
           <w:sz w:val="21"/>
         </w:rPr>
-        <w:t>03:15</w:t>
+        <w:t>04:45</w:t>
       </w:r>
       <w:r>
         <w:rPr>
@@ -1606,10 +1765,17 @@
       </w:r>
       <w:r>
         <w:rPr>
-          <w:b w:val="0"/>
-          <w:sz w:val="21"/>
-        </w:rPr>
-        <w:t xml:space="preserve">Run a containerized Apache web server from the image </w:t>
+          <w:b/>
+          <w:sz w:val="21"/>
+        </w:rPr>
+        <w:t>On node1:</w:t>
+      </w:r>
+      <w:r>
+        <w:rPr>
+          <w:b w:val="0"/>
+          <w:sz w:val="21"/>
+        </w:rPr>
+        <w:t xml:space="preserve"> create a user named </w:t>
       </w:r>
       <w:r>
         <w:rPr>
@@ -1618,14 +1784,14 @@
           <w:color w:val="C2560B"/>
           <w:sz w:val="19"/>
         </w:rPr>
-        <w:t>registry.access.redhat.com/ubi9/httpd-24</w:t>
-      </w:r>
-      <w:r>
-        <w:rPr>
-          <w:b w:val="0"/>
-          <w:sz w:val="21"/>
-        </w:rPr>
-        <w:t xml:space="preserve"> with the name </w:t>
+        <w:t>chef</w:t>
+      </w:r>
+      <w:r>
+        <w:rPr>
+          <w:b w:val="0"/>
+          <w:sz w:val="21"/>
+        </w:rPr>
+        <w:t xml:space="preserve"> with the password </w:t>
       </w:r>
       <w:r>
         <w:rPr>
@@ -1634,14 +1800,14 @@
           <w:color w:val="C2560B"/>
           <w:sz w:val="19"/>
         </w:rPr>
-        <w:t>webfront</w:t>
-      </w:r>
-      <w:r>
-        <w:rPr>
-          <w:b w:val="0"/>
-          <w:sz w:val="21"/>
-        </w:rPr>
-        <w:t xml:space="preserve">. Create a new user with your name to own the container (if your name is James, </w:t>
+        <w:t>redhat</w:t>
+      </w:r>
+      <w:r>
+        <w:rPr>
+          <w:b w:val="0"/>
+          <w:sz w:val="21"/>
+        </w:rPr>
+        <w:t xml:space="preserve">. As </w:t>
       </w:r>
       <w:r>
         <w:rPr>
@@ -1650,14 +1816,14 @@
           <w:color w:val="C2560B"/>
           <w:sz w:val="19"/>
         </w:rPr>
-        <w:t>james</w:t>
-      </w:r>
-      <w:r>
-        <w:rPr>
-          <w:b w:val="0"/>
-          <w:sz w:val="21"/>
-        </w:rPr>
-        <w:t xml:space="preserve">), and set its password to </w:t>
+        <w:t>chef</w:t>
+      </w:r>
+      <w:r>
+        <w:rPr>
+          <w:b w:val="0"/>
+          <w:sz w:val="21"/>
+        </w:rPr>
+        <w:t xml:space="preserve">, run a rootless container named </w:t>
       </w:r>
       <w:r>
         <w:rPr>
@@ -1666,7 +1832,23 @@
           <w:color w:val="C2560B"/>
           <w:sz w:val="19"/>
         </w:rPr>
-        <w:t>redhat</w:t>
+        <w:t>webfront</w:t>
+      </w:r>
+      <w:r>
+        <w:rPr>
+          <w:b w:val="0"/>
+          <w:sz w:val="21"/>
+        </w:rPr>
+        <w:t xml:space="preserve"> from the image </w:t>
+      </w:r>
+      <w:r>
+        <w:rPr>
+          <w:rFonts w:ascii="Courier New" w:hAnsi="Courier New" w:eastAsia="Courier New"/>
+          <w:b w:val="0"/>
+          <w:color w:val="C2560B"/>
+          <w:sz w:val="19"/>
+        </w:rPr>
+        <w:t>registry.access.redhat.com/ubi9/httpd-24</w:t>
       </w:r>
       <w:r>
         <w:rPr>
@@ -1692,7 +1874,21 @@
           <w:b w:val="0"/>
           <w:sz w:val="21"/>
         </w:rPr>
-        <w:t xml:space="preserve">The container must serve the contents of the host directory </w:t>
+        <w:t xml:space="preserve">Inside the container, the web server listens on port </w:t>
+      </w:r>
+      <w:r>
+        <w:rPr>
+          <w:b/>
+          <w:sz w:val="21"/>
+        </w:rPr>
+        <w:t>8080</w:t>
+      </w:r>
+      <w:r>
+        <w:rPr>
+          <w:b w:val="0"/>
+          <w:sz w:val="21"/>
+        </w:rPr>
+        <w:t xml:space="preserve"> and serves </w:t>
       </w:r>
       <w:r>
         <w:rPr>
@@ -1701,76 +1897,14 @@
           <w:color w:val="C2560B"/>
           <w:sz w:val="19"/>
         </w:rPr>
-        <w:t>/srv/site</w:t>
-      </w:r>
-      <w:r>
-        <w:rPr>
-          <w:b w:val="0"/>
-          <w:sz w:val="21"/>
-        </w:rPr>
-        <w:t xml:space="preserve">, mapped to the container's document root, published on host port </w:t>
-      </w:r>
-      <w:r>
-        <w:rPr>
-          <w:b/>
-          <w:sz w:val="21"/>
-        </w:rPr>
-        <w:t>35565</w:t>
-      </w:r>
-      <w:r>
-        <w:rPr>
-          <w:b w:val="0"/>
-          <w:sz w:val="21"/>
-        </w:rPr>
-        <w:t xml:space="preserve">. Put a file </w:t>
-      </w:r>
-      <w:r>
-        <w:rPr>
-          <w:rFonts w:ascii="Courier New" w:hAnsi="Courier New" w:eastAsia="Courier New"/>
-          <w:b w:val="0"/>
-          <w:color w:val="C2560B"/>
-          <w:sz w:val="19"/>
-        </w:rPr>
-        <w:t>index.html</w:t>
-      </w:r>
-      <w:r>
-        <w:rPr>
-          <w:b w:val="0"/>
-          <w:sz w:val="21"/>
-        </w:rPr>
-        <w:t xml:space="preserve"> in </w:t>
-      </w:r>
-      <w:r>
-        <w:rPr>
-          <w:rFonts w:ascii="Courier New" w:hAnsi="Courier New" w:eastAsia="Courier New"/>
-          <w:b w:val="0"/>
-          <w:color w:val="C2560B"/>
-          <w:sz w:val="19"/>
-        </w:rPr>
-        <w:t>/srv/site</w:t>
-      </w:r>
-      <w:r>
-        <w:rPr>
-          <w:b w:val="0"/>
-          <w:sz w:val="21"/>
-        </w:rPr>
-        <w:t xml:space="preserve"> containing exactly </w:t>
-      </w:r>
-      <w:r>
-        <w:rPr>
-          <w:rFonts w:ascii="Courier New" w:hAnsi="Courier New" w:eastAsia="Courier New"/>
-          <w:b w:val="0"/>
-          <w:color w:val="C2560B"/>
-          <w:sz w:val="19"/>
-        </w:rPr>
-        <w:t>Mock1 container OK</w:t>
-      </w:r>
-      <w:r>
-        <w:rPr>
-          <w:b w:val="0"/>
-          <w:sz w:val="21"/>
-        </w:rPr>
-        <w:t>. The port must remain reachable after a firewall reload and after a reboot.</w:t>
+        <w:t>/var/www/html</w:t>
+      </w:r>
+      <w:r>
+        <w:rPr>
+          <w:b w:val="0"/>
+          <w:sz w:val="21"/>
+        </w:rPr>
+        <w:t>.</w:t>
       </w:r>
     </w:p>
     <w:p>
@@ -1789,7 +1923,21 @@
           <w:b w:val="0"/>
           <w:sz w:val="21"/>
         </w:rPr>
-        <w:t>SELinux must allow the setup without disabling SELinux or setting it to permissive.</w:t>
+        <w:t xml:space="preserve">Publish container port 8080 on host port </w:t>
+      </w:r>
+      <w:r>
+        <w:rPr>
+          <w:b/>
+          <w:sz w:val="21"/>
+        </w:rPr>
+        <w:t>35565</w:t>
+      </w:r>
+      <w:r>
+        <w:rPr>
+          <w:b w:val="0"/>
+          <w:sz w:val="21"/>
+        </w:rPr>
+        <w:t>. The port must stay reachable after a firewall reload and after a reboot.</w:t>
       </w:r>
     </w:p>
     <w:p>
@@ -1808,7 +1956,125 @@
           <w:b w:val="0"/>
           <w:sz w:val="21"/>
         </w:rPr>
-        <w:t>The container must persist across boots.</w:t>
+        <w:t xml:space="preserve">Create </w:t>
+      </w:r>
+      <w:r>
+        <w:rPr>
+          <w:rFonts w:ascii="Courier New" w:hAnsi="Courier New" w:eastAsia="Courier New"/>
+          <w:b w:val="0"/>
+          <w:color w:val="C2560B"/>
+          <w:sz w:val="19"/>
+        </w:rPr>
+        <w:t>/srv/site/index.html</w:t>
+      </w:r>
+      <w:r>
+        <w:rPr>
+          <w:b w:val="0"/>
+          <w:sz w:val="21"/>
+        </w:rPr>
+        <w:t xml:space="preserve"> containing exactly </w:t>
+      </w:r>
+      <w:r>
+        <w:rPr>
+          <w:rFonts w:ascii="Courier New" w:hAnsi="Courier New" w:eastAsia="Courier New"/>
+          <w:b w:val="0"/>
+          <w:color w:val="C2560B"/>
+          <w:sz w:val="19"/>
+        </w:rPr>
+        <w:t>Mock1 container OK</w:t>
+      </w:r>
+      <w:r>
+        <w:rPr>
+          <w:b w:val="0"/>
+          <w:sz w:val="21"/>
+        </w:rPr>
+        <w:t xml:space="preserve">, and map the host directory </w:t>
+      </w:r>
+      <w:r>
+        <w:rPr>
+          <w:rFonts w:ascii="Courier New" w:hAnsi="Courier New" w:eastAsia="Courier New"/>
+          <w:b w:val="0"/>
+          <w:color w:val="C2560B"/>
+          <w:sz w:val="19"/>
+        </w:rPr>
+        <w:t>/srv/site</w:t>
+      </w:r>
+      <w:r>
+        <w:rPr>
+          <w:b w:val="0"/>
+          <w:sz w:val="21"/>
+        </w:rPr>
+        <w:t xml:space="preserve"> to the container's </w:t>
+      </w:r>
+      <w:r>
+        <w:rPr>
+          <w:rFonts w:ascii="Courier New" w:hAnsi="Courier New" w:eastAsia="Courier New"/>
+          <w:b w:val="0"/>
+          <w:color w:val="C2560B"/>
+          <w:sz w:val="19"/>
+        </w:rPr>
+        <w:t>/var/www/html</w:t>
+      </w:r>
+      <w:r>
+        <w:rPr>
+          <w:b w:val="0"/>
+          <w:sz w:val="21"/>
+        </w:rPr>
+        <w:t>.</w:t>
+      </w:r>
+    </w:p>
+    <w:p>
+      <w:pPr>
+        <w:spacing w:before="0" w:after="60"/>
+        <w:ind w:left="965" w:hanging="259"/>
+      </w:pPr>
+      <w:r>
+        <w:rPr>
+          <w:sz w:val="21"/>
+        </w:rPr>
+        <w:t xml:space="preserve">•  </w:t>
+      </w:r>
+      <w:r>
+        <w:rPr>
+          <w:b w:val="0"/>
+          <w:sz w:val="21"/>
+        </w:rPr>
+        <w:t>SELinux must allow the setup without disabling SELinux or setting it to permissive.</w:t>
+      </w:r>
+    </w:p>
+    <w:p>
+      <w:pPr>
+        <w:spacing w:before="0" w:after="60"/>
+        <w:ind w:left="965" w:hanging="259"/>
+      </w:pPr>
+      <w:r>
+        <w:rPr>
+          <w:sz w:val="21"/>
+        </w:rPr>
+        <w:t xml:space="preserve">•  </w:t>
+      </w:r>
+      <w:r>
+        <w:rPr>
+          <w:b w:val="0"/>
+          <w:sz w:val="21"/>
+        </w:rPr>
+        <w:t xml:space="preserve">The container must start automatically at boot as a systemd service of </w:t>
+      </w:r>
+      <w:r>
+        <w:rPr>
+          <w:rFonts w:ascii="Courier New" w:hAnsi="Courier New" w:eastAsia="Courier New"/>
+          <w:b w:val="0"/>
+          <w:color w:val="C2560B"/>
+          <w:sz w:val="19"/>
+        </w:rPr>
+        <w:t>chef</w:t>
+      </w:r>
+      <w:r>
+        <w:rPr>
+          <w:b w:val="0"/>
+          <w:sz w:val="21"/>
+        </w:rPr>
+        <w:t>, without anyone logging in.</w:t>
       </w:r>
     </w:p>
     <w:p>
@@ -1830,10 +2096,17 @@
       </w:r>
       <w:r>
         <w:rPr>
-          <w:b w:val="0"/>
-          <w:sz w:val="21"/>
-        </w:rPr>
-        <w:t xml:space="preserve">SELinux must be running in </w:t>
+          <w:b/>
+          <w:sz w:val="21"/>
+        </w:rPr>
+        <w:t>On node1:</w:t>
+      </w:r>
+      <w:r>
+        <w:rPr>
+          <w:b w:val="0"/>
+          <w:sz w:val="21"/>
+        </w:rPr>
+        <w:t xml:space="preserve"> SELinux must be running in </w:t>
       </w:r>
       <w:r>
         <w:rPr>
@@ -1869,16 +2142,23 @@
       </w:r>
       <w:r>
         <w:rPr>
-          <w:b w:val="0"/>
-          <w:sz w:val="21"/>
-        </w:rPr>
-        <w:t xml:space="preserve">Add </w:t>
-      </w:r>
-      <w:r>
-        <w:rPr>
           <w:b/>
           <w:sz w:val="21"/>
         </w:rPr>
+        <w:t>On node1:</w:t>
+      </w:r>
+      <w:r>
+        <w:rPr>
+          <w:b w:val="0"/>
+          <w:sz w:val="21"/>
+        </w:rPr>
+        <w:t xml:space="preserve"> add </w:t>
+      </w:r>
+      <w:r>
+        <w:rPr>
+          <w:b/>
+          <w:sz w:val="21"/>
+        </w:rPr>
         <w:t>1 GiB</w:t>
       </w:r>
       <w:r>
@@ -1886,7 +2166,7 @@
           <w:b w:val="0"/>
           <w:sz w:val="21"/>
         </w:rPr>
-        <w:t xml:space="preserve"> of additional swap space to the system using the attached volume </w:t>
+        <w:t xml:space="preserve"> of additional swap space by creating a 1 GiB partition on the disk </w:t>
       </w:r>
       <w:r>
         <w:rPr>
@@ -1902,7 +2182,7 @@
           <w:b w:val="0"/>
           <w:sz w:val="21"/>
         </w:rPr>
-        <w:t>. The swap must be active immediately and remain active after a reboot.</w:t>
+        <w:t>. The swap must be active immediately and remain active after a reboot. Do not change any existing swap.</w:t>
       </w:r>
     </w:p>
     <w:p>
@@ -1924,10 +2204,17 @@
       </w:r>
       <w:r>
         <w:rPr>
-          <w:b w:val="0"/>
-          <w:sz w:val="21"/>
-        </w:rPr>
-        <w:t>Make the systemd journal persistent so that logs survive a reboot.</w:t>
+          <w:b/>
+          <w:sz w:val="21"/>
+        </w:rPr>
+        <w:t>On node1:</w:t>
+      </w:r>
+      <w:r>
+        <w:rPr>
+          <w:b w:val="0"/>
+          <w:sz w:val="21"/>
+        </w:rPr>
+        <w:t xml:space="preserve"> make the systemd journal persistent so that logs survive a reboot.</w:t>
       </w:r>
     </w:p>
     <w:p>
@@ -1949,10 +2236,17 @@
       </w:r>
       <w:r>
         <w:rPr>
-          <w:b w:val="0"/>
-          <w:sz w:val="21"/>
-        </w:rPr>
-        <w:t xml:space="preserve">A clean, unformatted 5 GiB disk </w:t>
+          <w:b/>
+          <w:sz w:val="21"/>
+        </w:rPr>
+        <w:t>On node1:</w:t>
+      </w:r>
+      <w:r>
+        <w:rPr>
+          <w:b w:val="0"/>
+          <w:sz w:val="21"/>
+        </w:rPr>
+        <w:t xml:space="preserve"> a clean, unformatted 5 GiB disk </w:t>
       </w:r>
       <w:r>
         <w:rPr>
@@ -2028,7 +2322,7 @@
           <w:b w:val="0"/>
           <w:sz w:val="21"/>
         </w:rPr>
-        <w:t xml:space="preserve">, create a thin pool with a real capacity of </w:t>
+        <w:t xml:space="preserve">, create a thin pool (any name) with a real capacity of </w:t>
       </w:r>
       <w:r>
         <w:rPr>
@@ -2126,10 +2420,17 @@
       </w:r>
       <w:r>
         <w:rPr>
-          <w:b w:val="0"/>
-          <w:sz w:val="21"/>
-        </w:rPr>
-        <w:t xml:space="preserve">From the remaining free extents of </w:t>
+          <w:b/>
+          <w:sz w:val="21"/>
+        </w:rPr>
+        <w:t>On node1:</w:t>
+      </w:r>
+      <w:r>
+        <w:rPr>
+          <w:b w:val="0"/>
+          <w:sz w:val="21"/>
+        </w:rPr>
+        <w:t xml:space="preserve"> from the remaining free extents of </w:t>
       </w:r>
       <w:r>
         <w:rPr>
@@ -2197,10 +2498,17 @@
       </w:r>
       <w:r>
         <w:rPr>
-          <w:b w:val="0"/>
-          <w:sz w:val="21"/>
-        </w:rPr>
-        <w:t>Install the Apache web server (</w:t>
+          <w:b/>
+          <w:sz w:val="21"/>
+        </w:rPr>
+        <w:t>On node1:</w:t>
+      </w:r>
+      <w:r>
+        <w:rPr>
+          <w:b w:val="0"/>
+          <w:sz w:val="21"/>
+        </w:rPr>
+        <w:t xml:space="preserve"> install the Apache web server (</w:t>
       </w:r>
       <w:r>
         <w:rPr>
@@ -2216,7 +2524,7 @@
           <w:b w:val="0"/>
           <w:sz w:val="21"/>
         </w:rPr>
-        <w:t xml:space="preserve">) and make sure it starts at every boot. Create </w:t>
+        <w:t xml:space="preserve">) and make sure it starts at every boot, on its default port 80. Create </w:t>
       </w:r>
       <w:r>
         <w:rPr>
@@ -2248,7 +2556,7 @@
           <w:b w:val="0"/>
           <w:sz w:val="21"/>
         </w:rPr>
-        <w:t xml:space="preserve">. Make the web server reachable through the firewall, and make sure the firewall change persists after a reboot. From node2, </w:t>
+        <w:t xml:space="preserve">. Allow the web server through the firewall, persistently. From node2, </w:t>
       </w:r>
       <w:r>
         <w:rPr>
@@ -2286,10 +2594,17 @@
       </w:r>
       <w:r>
         <w:rPr>
-          <w:b w:val="0"/>
-          <w:sz w:val="21"/>
-        </w:rPr>
-        <w:t xml:space="preserve">Create a user named </w:t>
+          <w:b/>
+          <w:sz w:val="21"/>
+        </w:rPr>
+        <w:t>On node1 and node2:</w:t>
+      </w:r>
+      <w:r>
+        <w:rPr>
+          <w:b w:val="0"/>
+          <w:sz w:val="21"/>
+        </w:rPr>
+        <w:t xml:space="preserve"> create a user named </w:t>
       </w:r>
       <w:r>
         <w:rPr>
@@ -2305,21 +2620,23 @@
           <w:b w:val="0"/>
           <w:sz w:val="21"/>
         </w:rPr>
-        <w:t xml:space="preserve"> on </w:t>
-      </w:r>
-      <w:r>
-        <w:rPr>
-          <w:b/>
-          <w:sz w:val="21"/>
-        </w:rPr>
-        <w:t>both</w:t>
-      </w:r>
-      <w:r>
-        <w:rPr>
-          <w:b w:val="0"/>
-          <w:sz w:val="21"/>
-        </w:rPr>
-        <w:t xml:space="preserve"> node1 and node2. From node2, </w:t>
+        <w:t xml:space="preserve"> with the password </w:t>
+      </w:r>
+      <w:r>
+        <w:rPr>
+          <w:rFonts w:ascii="Courier New" w:hAnsi="Courier New" w:eastAsia="Courier New"/>
+          <w:b w:val="0"/>
+          <w:color w:val="C2560B"/>
+          <w:sz w:val="19"/>
+        </w:rPr>
+        <w:t>redhat</w:t>
+      </w:r>
+      <w:r>
+        <w:rPr>
+          <w:b w:val="0"/>
+          <w:sz w:val="21"/>
+        </w:rPr>
+        <w:t xml:space="preserve"> on both nodes. From node2, </w:t>
       </w:r>
       <w:r>
         <w:rPr>
@@ -2373,10 +2690,17 @@
       </w:r>
       <w:r>
         <w:rPr>
-          <w:b w:val="0"/>
-          <w:sz w:val="21"/>
-        </w:rPr>
-        <w:t>Harden SSH on node1:</w:t>
+          <w:b/>
+          <w:sz w:val="21"/>
+        </w:rPr>
+        <w:t>On node1:</w:t>
+      </w:r>
+      <w:r>
+        <w:rPr>
+          <w:b w:val="0"/>
+          <w:sz w:val="21"/>
+        </w:rPr>
+        <w:t xml:space="preserve"> harden SSH:</w:t>
       </w:r>
     </w:p>
     <w:p>
@@ -2430,7 +2754,23 @@
           <w:b w:val="0"/>
           <w:sz w:val="21"/>
         </w:rPr>
-        <w:t xml:space="preserve"> may log in through SSH. All other users, including root, must be denied.</w:t>
+        <w:t xml:space="preserve"> may log in through SSH. All other users, including root and </w:t>
+      </w:r>
+      <w:r>
+        <w:rPr>
+          <w:rFonts w:ascii="Courier New" w:hAnsi="Courier New" w:eastAsia="Courier New"/>
+          <w:b w:val="0"/>
+          <w:color w:val="C2560B"/>
+          <w:sz w:val="19"/>
+        </w:rPr>
+        <w:t>chef</w:t>
+      </w:r>
+      <w:r>
+        <w:rPr>
+          <w:b w:val="0"/>
+          <w:sz w:val="21"/>
+        </w:rPr>
+        <w:t>, must be denied.</w:t>
       </w:r>
     </w:p>
     <w:p>
@@ -2452,10 +2792,17 @@
       </w:r>
       <w:r>
         <w:rPr>
-          <w:b w:val="0"/>
-          <w:sz w:val="21"/>
-        </w:rPr>
-        <w:t>Using the NFS server from task 5, configure autofs on node1 so that both shares mount automatically on demand:</w:t>
+          <w:b/>
+          <w:sz w:val="21"/>
+        </w:rPr>
+        <w:t>On node1:</w:t>
+      </w:r>
+      <w:r>
+        <w:rPr>
+          <w:b w:val="0"/>
+          <w:sz w:val="21"/>
+        </w:rPr>
+        <w:t xml:space="preserve"> using the NFS server from task 5, configure autofs so that both shares mount automatically on demand. Use any map type.</w:t>
       </w:r>
     </w:p>
     <w:p>
@@ -2573,6 +2920,374 @@
           <w:sz w:val="21"/>
         </w:rPr>
         <w:t>. The mounts must appear when accessed, and the configuration must survive a reboot.</w:t>
+      </w:r>
+    </w:p>
+    <w:p>
+      <w:pPr>
+        <w:keepNext w:val="0"/>
+        <w:tabs>
+          <w:tab w:pos="605" w:val="left"/>
+        </w:tabs>
+        <w:spacing w:before="120" w:after="60"/>
+        <w:ind w:left="605" w:hanging="605"/>
+      </w:pPr>
+      <w:r>
+        <w:rPr>
+          <w:b/>
+          <w:sz w:val="21"/>
+        </w:rPr>
+        <w:t>21.</w:t>
+        <w:tab/>
+      </w:r>
+      <w:r>
+        <w:rPr>
+          <w:b/>
+          <w:sz w:val="21"/>
+        </w:rPr>
+        <w:t>On node1:</w:t>
+      </w:r>
+      <w:r>
+        <w:rPr>
+          <w:b w:val="0"/>
+          <w:sz w:val="21"/>
+        </w:rPr>
+        <w:t xml:space="preserve"> configure local name resolution, without DNS, so that </w:t>
+      </w:r>
+      <w:r>
+        <w:rPr>
+          <w:rFonts w:ascii="Courier New" w:hAnsi="Courier New" w:eastAsia="Courier New"/>
+          <w:b w:val="0"/>
+          <w:color w:val="C2560B"/>
+          <w:sz w:val="19"/>
+        </w:rPr>
+        <w:t>node1</w:t>
+      </w:r>
+      <w:r>
+        <w:rPr>
+          <w:b w:val="0"/>
+          <w:sz w:val="21"/>
+        </w:rPr>
+        <w:t xml:space="preserve"> and </w:t>
+      </w:r>
+      <w:r>
+        <w:rPr>
+          <w:rFonts w:ascii="Courier New" w:hAnsi="Courier New" w:eastAsia="Courier New"/>
+          <w:b w:val="0"/>
+          <w:color w:val="C2560B"/>
+          <w:sz w:val="19"/>
+        </w:rPr>
+        <w:t>node1.lab.example</w:t>
+      </w:r>
+      <w:r>
+        <w:rPr>
+          <w:b w:val="0"/>
+          <w:sz w:val="21"/>
+        </w:rPr>
+        <w:t xml:space="preserve"> resolve to node1's IP address, and </w:t>
+      </w:r>
+      <w:r>
+        <w:rPr>
+          <w:rFonts w:ascii="Courier New" w:hAnsi="Courier New" w:eastAsia="Courier New"/>
+          <w:b w:val="0"/>
+          <w:color w:val="C2560B"/>
+          <w:sz w:val="19"/>
+        </w:rPr>
+        <w:t>node2</w:t>
+      </w:r>
+      <w:r>
+        <w:rPr>
+          <w:b w:val="0"/>
+          <w:sz w:val="21"/>
+        </w:rPr>
+        <w:t xml:space="preserve"> and </w:t>
+      </w:r>
+      <w:r>
+        <w:rPr>
+          <w:rFonts w:ascii="Courier New" w:hAnsi="Courier New" w:eastAsia="Courier New"/>
+          <w:b w:val="0"/>
+          <w:color w:val="C2560B"/>
+          <w:sz w:val="19"/>
+        </w:rPr>
+        <w:t>node2.lab.example</w:t>
+      </w:r>
+      <w:r>
+        <w:rPr>
+          <w:b w:val="0"/>
+          <w:sz w:val="21"/>
+        </w:rPr>
+        <w:t xml:space="preserve"> resolve to node2's IP address.</w:t>
+      </w:r>
+    </w:p>
+    <w:p>
+      <w:pPr>
+        <w:keepNext w:val="0"/>
+        <w:tabs>
+          <w:tab w:pos="605" w:val="left"/>
+        </w:tabs>
+        <w:spacing w:before="120" w:after="60"/>
+        <w:ind w:left="605" w:hanging="605"/>
+      </w:pPr>
+      <w:r>
+        <w:rPr>
+          <w:b/>
+          <w:sz w:val="21"/>
+        </w:rPr>
+        <w:t>22.</w:t>
+        <w:tab/>
+      </w:r>
+      <w:r>
+        <w:rPr>
+          <w:b/>
+          <w:sz w:val="21"/>
+        </w:rPr>
+        <w:t>On node2:</w:t>
+      </w:r>
+      <w:r>
+        <w:rPr>
+          <w:b w:val="0"/>
+          <w:sz w:val="21"/>
+        </w:rPr>
+        <w:t xml:space="preserve"> configure the same four names as task 21.</w:t>
+      </w:r>
+    </w:p>
+    <w:p>
+      <w:pPr>
+        <w:keepNext w:val="0"/>
+        <w:tabs>
+          <w:tab w:pos="605" w:val="left"/>
+        </w:tabs>
+        <w:spacing w:before="120" w:after="60"/>
+        <w:ind w:left="605" w:hanging="605"/>
+      </w:pPr>
+      <w:r>
+        <w:rPr>
+          <w:b/>
+          <w:sz w:val="21"/>
+        </w:rPr>
+        <w:t>23.</w:t>
+        <w:tab/>
+      </w:r>
+      <w:r>
+        <w:rPr>
+          <w:b/>
+          <w:sz w:val="21"/>
+        </w:rPr>
+        <w:t>On node1:</w:t>
+      </w:r>
+      <w:r>
+        <w:rPr>
+          <w:b w:val="0"/>
+          <w:sz w:val="21"/>
+        </w:rPr>
+        <w:t xml:space="preserve"> set the system's static hostname to </w:t>
+      </w:r>
+      <w:r>
+        <w:rPr>
+          <w:rFonts w:ascii="Courier New" w:hAnsi="Courier New" w:eastAsia="Courier New"/>
+          <w:b w:val="0"/>
+          <w:color w:val="C2560B"/>
+          <w:sz w:val="19"/>
+        </w:rPr>
+        <w:t>node1.lab.example</w:t>
+      </w:r>
+      <w:r>
+        <w:rPr>
+          <w:b w:val="0"/>
+          <w:sz w:val="21"/>
+        </w:rPr>
+        <w:t>, persistently.</w:t>
+      </w:r>
+    </w:p>
+    <w:p>
+      <w:pPr>
+        <w:keepNext w:val="0"/>
+        <w:tabs>
+          <w:tab w:pos="605" w:val="left"/>
+        </w:tabs>
+        <w:spacing w:before="120" w:after="60"/>
+        <w:ind w:left="605" w:hanging="605"/>
+      </w:pPr>
+      <w:r>
+        <w:rPr>
+          <w:b/>
+          <w:sz w:val="21"/>
+        </w:rPr>
+        <w:t>24.</w:t>
+        <w:tab/>
+      </w:r>
+      <w:r>
+        <w:rPr>
+          <w:b/>
+          <w:sz w:val="21"/>
+        </w:rPr>
+        <w:t>On node1:</w:t>
+      </w:r>
+      <w:r>
+        <w:rPr>
+          <w:b w:val="0"/>
+          <w:sz w:val="21"/>
+        </w:rPr>
+        <w:t xml:space="preserve"> create a gzip-compressed tar archive of the whole </w:t>
+      </w:r>
+      <w:r>
+        <w:rPr>
+          <w:rFonts w:ascii="Courier New" w:hAnsi="Courier New" w:eastAsia="Courier New"/>
+          <w:b w:val="0"/>
+          <w:color w:val="C2560B"/>
+          <w:sz w:val="19"/>
+        </w:rPr>
+        <w:t>/etc</w:t>
+      </w:r>
+      <w:r>
+        <w:rPr>
+          <w:b w:val="0"/>
+          <w:sz w:val="21"/>
+        </w:rPr>
+        <w:t xml:space="preserve"> directory at </w:t>
+      </w:r>
+      <w:r>
+        <w:rPr>
+          <w:rFonts w:ascii="Courier New" w:hAnsi="Courier New" w:eastAsia="Courier New"/>
+          <w:b w:val="0"/>
+          <w:color w:val="C2560B"/>
+          <w:sz w:val="19"/>
+        </w:rPr>
+        <w:t>/root/etc-backup.tar.gz</w:t>
+      </w:r>
+      <w:r>
+        <w:rPr>
+          <w:b w:val="0"/>
+          <w:sz w:val="21"/>
+        </w:rPr>
+        <w:t>.</w:t>
+      </w:r>
+    </w:p>
+    <w:p>
+      <w:pPr>
+        <w:keepNext w:val="0"/>
+        <w:tabs>
+          <w:tab w:pos="605" w:val="left"/>
+        </w:tabs>
+        <w:spacing w:before="120" w:after="60"/>
+        <w:ind w:left="605" w:hanging="605"/>
+      </w:pPr>
+      <w:r>
+        <w:rPr>
+          <w:b/>
+          <w:sz w:val="21"/>
+        </w:rPr>
+        <w:t>25.</w:t>
+        <w:tab/>
+      </w:r>
+      <w:r>
+        <w:rPr>
+          <w:b/>
+          <w:sz w:val="21"/>
+        </w:rPr>
+        <w:t>On node1:</w:t>
+      </w:r>
+      <w:r>
+        <w:rPr>
+          <w:b w:val="0"/>
+          <w:sz w:val="21"/>
+        </w:rPr>
+        <w:t xml:space="preserve"> copy every line of </w:t>
+      </w:r>
+      <w:r>
+        <w:rPr>
+          <w:rFonts w:ascii="Courier New" w:hAnsi="Courier New" w:eastAsia="Courier New"/>
+          <w:b w:val="0"/>
+          <w:color w:val="C2560B"/>
+          <w:sz w:val="19"/>
+        </w:rPr>
+        <w:t>/etc/services</w:t>
+      </w:r>
+      <w:r>
+        <w:rPr>
+          <w:b w:val="0"/>
+          <w:sz w:val="21"/>
+        </w:rPr>
+        <w:t xml:space="preserve"> that contains the string </w:t>
+      </w:r>
+      <w:r>
+        <w:rPr>
+          <w:rFonts w:ascii="Courier New" w:hAnsi="Courier New" w:eastAsia="Courier New"/>
+          <w:b w:val="0"/>
+          <w:color w:val="C2560B"/>
+          <w:sz w:val="19"/>
+        </w:rPr>
+        <w:t>ssh</w:t>
+      </w:r>
+      <w:r>
+        <w:rPr>
+          <w:b w:val="0"/>
+          <w:sz w:val="21"/>
+        </w:rPr>
+        <w:t xml:space="preserve"> into </w:t>
+      </w:r>
+      <w:r>
+        <w:rPr>
+          <w:rFonts w:ascii="Courier New" w:hAnsi="Courier New" w:eastAsia="Courier New"/>
+          <w:b w:val="0"/>
+          <w:color w:val="C2560B"/>
+          <w:sz w:val="19"/>
+        </w:rPr>
+        <w:t>/root/ssh-lines.txt</w:t>
+      </w:r>
+      <w:r>
+        <w:rPr>
+          <w:b w:val="0"/>
+          <w:sz w:val="21"/>
+        </w:rPr>
+        <w:t>, in their original order and with nothing else in the file.</w:t>
+      </w:r>
+    </w:p>
+    <w:p>
+      <w:pPr>
+        <w:keepNext w:val="0"/>
+        <w:tabs>
+          <w:tab w:pos="605" w:val="left"/>
+        </w:tabs>
+        <w:spacing w:before="120" w:after="60"/>
+        <w:ind w:left="605" w:hanging="605"/>
+      </w:pPr>
+      <w:r>
+        <w:rPr>
+          <w:b/>
+          <w:sz w:val="21"/>
+        </w:rPr>
+        <w:t>26.</w:t>
+        <w:tab/>
+      </w:r>
+      <w:r>
+        <w:rPr>
+          <w:b/>
+          <w:sz w:val="21"/>
+        </w:rPr>
+        <w:t>On node1:</w:t>
+      </w:r>
+      <w:r>
+        <w:rPr>
+          <w:b w:val="0"/>
+          <w:sz w:val="21"/>
+        </w:rPr>
+        <w:t xml:space="preserve"> make </w:t>
+      </w:r>
+      <w:r>
+        <w:rPr>
+          <w:rFonts w:ascii="Courier New" w:hAnsi="Courier New" w:eastAsia="Courier New"/>
+          <w:b w:val="0"/>
+          <w:color w:val="C2560B"/>
+          <w:sz w:val="19"/>
+        </w:rPr>
+        <w:t>throughput-performance</w:t>
+      </w:r>
+      <w:r>
+        <w:rPr>
+          <w:b w:val="0"/>
+          <w:sz w:val="21"/>
+        </w:rPr>
+        <w:t xml:space="preserve"> the active tuned profile, persistently.</w:t>
       </w:r>
     </w:p>
     <w:p>
@@ -2610,7 +3325,833 @@
           <w:b w:val="0"/>
           <w:sz w:val="21"/>
         </w:rPr>
-        <w:t>Reboot node2, then node1. Grade as root on each node:</w:t>
+        <w:t xml:space="preserve">Stop working. Reboot node2, then node1, and grade both nodes as described in </w:t>
+      </w:r>
+      <w:r>
+        <w:rPr>
+          <w:b/>
+          <w:sz w:val="21"/>
+        </w:rPr>
+        <w:t>Appendix C</w:t>
+      </w:r>
+      <w:r>
+        <w:rPr>
+          <w:b w:val="0"/>
+          <w:sz w:val="21"/>
+        </w:rPr>
+        <w:t>.</w:t>
+      </w:r>
+    </w:p>
+    <w:p>
+      <w:pPr>
+        <w:pStyle w:val="Heading2"/>
+        <w:spacing w:before="280" w:after="120"/>
+        <w:pBdr>
+          <w:bottom w:val="single" w:sz="6" w:space="1" w:color="E0E0E0"/>
+        </w:pBdr>
+      </w:pPr>
+      <w:r>
+        <w:rPr>
+          <w:b/>
+          <w:color w:val="000000"/>
+          <w:sz w:val="27"/>
+        </w:rPr>
+        <w:t>Appendix A — Build the lab (once)</w:t>
+      </w:r>
+    </w:p>
+    <w:p>
+      <w:pPr>
+        <w:spacing w:before="0" w:after="100"/>
+        <w:ind w:left="0"/>
+      </w:pPr>
+      <w:r>
+        <w:rPr>
+          <w:b w:val="0"/>
+          <w:sz w:val="21"/>
+        </w:rPr>
+        <w:t xml:space="preserve">You need VirtualBox and the </w:t>
+      </w:r>
+      <w:r>
+        <w:rPr>
+          <w:b/>
+          <w:sz w:val="21"/>
+        </w:rPr>
+        <w:t>RHEL 9 DVD ISO</w:t>
+      </w:r>
+      <w:r>
+        <w:rPr>
+          <w:b w:val="0"/>
+          <w:sz w:val="21"/>
+        </w:rPr>
+        <w:t xml:space="preserve"> (free with a Red Hat Developer account at developers.redhat.com). Use the DVD ISO, not the boot ISO: only the DVD has the BaseOS and AppStream repositories.</w:t>
+      </w:r>
+    </w:p>
+    <w:p>
+      <w:pPr>
+        <w:keepNext w:val="0"/>
+        <w:tabs>
+          <w:tab w:pos="605" w:val="left"/>
+        </w:tabs>
+        <w:spacing w:before="120" w:after="60"/>
+        <w:ind w:left="605" w:hanging="605"/>
+      </w:pPr>
+      <w:r>
+        <w:rPr>
+          <w:b/>
+          <w:sz w:val="21"/>
+        </w:rPr>
+        <w:t>1.</w:t>
+        <w:tab/>
+      </w:r>
+      <w:r>
+        <w:rPr>
+          <w:b/>
+          <w:sz w:val="21"/>
+        </w:rPr>
+        <w:t>Create two VMs</w:t>
+      </w:r>
+      <w:r>
+        <w:rPr>
+          <w:b w:val="0"/>
+          <w:sz w:val="21"/>
+        </w:rPr>
+        <w:t xml:space="preserve">, </w:t>
+      </w:r>
+      <w:r>
+        <w:rPr>
+          <w:rFonts w:ascii="Courier New" w:hAnsi="Courier New" w:eastAsia="Courier New"/>
+          <w:b w:val="0"/>
+          <w:color w:val="C2560B"/>
+          <w:sz w:val="19"/>
+        </w:rPr>
+        <w:t>node1</w:t>
+      </w:r>
+      <w:r>
+        <w:rPr>
+          <w:b w:val="0"/>
+          <w:sz w:val="21"/>
+        </w:rPr>
+        <w:t xml:space="preserve"> and </w:t>
+      </w:r>
+      <w:r>
+        <w:rPr>
+          <w:rFonts w:ascii="Courier New" w:hAnsi="Courier New" w:eastAsia="Courier New"/>
+          <w:b w:val="0"/>
+          <w:color w:val="C2560B"/>
+          <w:sz w:val="19"/>
+        </w:rPr>
+        <w:t>node2</w:t>
+      </w:r>
+      <w:r>
+        <w:rPr>
+          <w:b w:val="0"/>
+          <w:sz w:val="21"/>
+        </w:rPr>
+        <w:t>: RHEL 9, 2 GB RAM, 2 CPUs and a 20 GB disk each. Install RHEL 9 normally, with a root password and a normal user you know.</w:t>
+      </w:r>
+    </w:p>
+    <w:p>
+      <w:pPr>
+        <w:keepNext w:val="0"/>
+        <w:tabs>
+          <w:tab w:pos="605" w:val="left"/>
+        </w:tabs>
+        <w:spacing w:before="120" w:after="60"/>
+        <w:ind w:left="605" w:hanging="605"/>
+      </w:pPr>
+      <w:r>
+        <w:rPr>
+          <w:b/>
+          <w:sz w:val="21"/>
+        </w:rPr>
+        <w:t>2.</w:t>
+        <w:tab/>
+      </w:r>
+      <w:r>
+        <w:rPr>
+          <w:b/>
+          <w:sz w:val="21"/>
+        </w:rPr>
+        <w:t>Add three disks to node1:</w:t>
+      </w:r>
+      <w:r>
+        <w:rPr>
+          <w:b w:val="0"/>
+          <w:sz w:val="21"/>
+        </w:rPr>
+        <w:t xml:space="preserve"> Settings → Storage → the SATA controller → *Add hard disk*: 5 GiB, 5 GiB and 2 GiB. Inside node1, </w:t>
+      </w:r>
+      <w:r>
+        <w:rPr>
+          <w:rFonts w:ascii="Courier New" w:hAnsi="Courier New" w:eastAsia="Courier New"/>
+          <w:b w:val="0"/>
+          <w:color w:val="C2560B"/>
+          <w:sz w:val="19"/>
+        </w:rPr>
+        <w:t>lsblk</w:t>
+      </w:r>
+      <w:r>
+        <w:rPr>
+          <w:b w:val="0"/>
+          <w:sz w:val="21"/>
+        </w:rPr>
+        <w:t xml:space="preserve"> should show them as </w:t>
+      </w:r>
+      <w:r>
+        <w:rPr>
+          <w:rFonts w:ascii="Courier New" w:hAnsi="Courier New" w:eastAsia="Courier New"/>
+          <w:b w:val="0"/>
+          <w:color w:val="C2560B"/>
+          <w:sz w:val="19"/>
+        </w:rPr>
+        <w:t>sdb</w:t>
+      </w:r>
+      <w:r>
+        <w:rPr>
+          <w:b w:val="0"/>
+          <w:sz w:val="21"/>
+        </w:rPr>
+        <w:t xml:space="preserve">, </w:t>
+      </w:r>
+      <w:r>
+        <w:rPr>
+          <w:rFonts w:ascii="Courier New" w:hAnsi="Courier New" w:eastAsia="Courier New"/>
+          <w:b w:val="0"/>
+          <w:color w:val="C2560B"/>
+          <w:sz w:val="19"/>
+        </w:rPr>
+        <w:t>sdc</w:t>
+      </w:r>
+      <w:r>
+        <w:rPr>
+          <w:b w:val="0"/>
+          <w:sz w:val="21"/>
+        </w:rPr>
+        <w:t xml:space="preserve"> and </w:t>
+      </w:r>
+      <w:r>
+        <w:rPr>
+          <w:rFonts w:ascii="Courier New" w:hAnsi="Courier New" w:eastAsia="Courier New"/>
+          <w:b w:val="0"/>
+          <w:color w:val="C2560B"/>
+          <w:sz w:val="19"/>
+        </w:rPr>
+        <w:t>sdd</w:t>
+      </w:r>
+      <w:r>
+        <w:rPr>
+          <w:b w:val="0"/>
+          <w:sz w:val="21"/>
+        </w:rPr>
+        <w:t>. If yours have other names, use your names in the tasks and when grading.</w:t>
+      </w:r>
+    </w:p>
+    <w:p>
+      <w:pPr>
+        <w:keepNext w:val="0"/>
+        <w:tabs>
+          <w:tab w:pos="605" w:val="left"/>
+        </w:tabs>
+        <w:spacing w:before="120" w:after="60"/>
+        <w:ind w:left="605" w:hanging="605"/>
+      </w:pPr>
+      <w:r>
+        <w:rPr>
+          <w:b/>
+          <w:sz w:val="21"/>
+        </w:rPr>
+        <w:t>3.</w:t>
+        <w:tab/>
+      </w:r>
+      <w:r>
+        <w:rPr>
+          <w:b/>
+          <w:sz w:val="21"/>
+        </w:rPr>
+        <w:t>Network, on both VMs:</w:t>
+      </w:r>
+      <w:r>
+        <w:rPr>
+          <w:b w:val="0"/>
+          <w:sz w:val="21"/>
+        </w:rPr>
+        <w:t xml:space="preserve"> Settings → Network:</w:t>
+      </w:r>
+    </w:p>
+    <w:p>
+      <w:pPr>
+        <w:spacing w:before="0" w:after="60"/>
+        <w:ind w:left="965" w:hanging="259"/>
+      </w:pPr>
+      <w:r>
+        <w:rPr>
+          <w:sz w:val="21"/>
+        </w:rPr>
+        <w:t xml:space="preserve">•  </w:t>
+      </w:r>
+      <w:r>
+        <w:rPr>
+          <w:b/>
+          <w:sz w:val="21"/>
+        </w:rPr>
+        <w:t>Adapter 1: NAT.</w:t>
+      </w:r>
+      <w:r>
+        <w:rPr>
+          <w:b w:val="0"/>
+          <w:sz w:val="21"/>
+        </w:rPr>
+        <w:t xml:space="preserve"> This is the internet connection.</w:t>
+      </w:r>
+    </w:p>
+    <w:p>
+      <w:pPr>
+        <w:spacing w:before="0" w:after="60"/>
+        <w:ind w:left="965" w:hanging="259"/>
+      </w:pPr>
+      <w:r>
+        <w:rPr>
+          <w:sz w:val="21"/>
+        </w:rPr>
+        <w:t xml:space="preserve">•  </w:t>
+      </w:r>
+      <w:r>
+        <w:rPr>
+          <w:b/>
+          <w:sz w:val="21"/>
+        </w:rPr>
+        <w:t>Adapter 2: Internal Network</w:t>
+      </w:r>
+      <w:r>
+        <w:rPr>
+          <w:b w:val="0"/>
+          <w:sz w:val="21"/>
+        </w:rPr>
+        <w:t xml:space="preserve">, named </w:t>
+      </w:r>
+      <w:r>
+        <w:rPr>
+          <w:rFonts w:ascii="Courier New" w:hAnsi="Courier New" w:eastAsia="Courier New"/>
+          <w:b w:val="0"/>
+          <w:color w:val="C2560B"/>
+          <w:sz w:val="19"/>
+        </w:rPr>
+        <w:t>rhcsa</w:t>
+      </w:r>
+      <w:r>
+        <w:rPr>
+          <w:b w:val="0"/>
+          <w:sz w:val="21"/>
+        </w:rPr>
+        <w:t xml:space="preserve"> on both VMs. This joins node1 to node2.</w:t>
+      </w:r>
+    </w:p>
+    <w:p>
+      <w:pPr>
+        <w:keepNext w:val="0"/>
+        <w:tabs>
+          <w:tab w:pos="605" w:val="left"/>
+        </w:tabs>
+        <w:spacing w:before="120" w:after="60"/>
+        <w:ind w:left="605" w:hanging="605"/>
+      </w:pPr>
+      <w:r>
+        <w:rPr>
+          <w:b/>
+          <w:sz w:val="21"/>
+        </w:rPr>
+        <w:t>4.</w:t>
+        <w:tab/>
+      </w:r>
+      <w:r>
+        <w:rPr>
+          <w:b/>
+          <w:sz w:val="21"/>
+        </w:rPr>
+        <w:t>Give adapter 2 a fixed IP.</w:t>
+      </w:r>
+      <w:r>
+        <w:rPr>
+          <w:b w:val="0"/>
+          <w:sz w:val="21"/>
+        </w:rPr>
+        <w:t xml:space="preserve"> In each VM, as root, find the second card's name with </w:t>
+      </w:r>
+      <w:r>
+        <w:rPr>
+          <w:rFonts w:ascii="Courier New" w:hAnsi="Courier New" w:eastAsia="Courier New"/>
+          <w:b w:val="0"/>
+          <w:color w:val="C2560B"/>
+          <w:sz w:val="19"/>
+        </w:rPr>
+        <w:t>ip -br a</w:t>
+      </w:r>
+      <w:r>
+        <w:rPr>
+          <w:b w:val="0"/>
+          <w:sz w:val="21"/>
+        </w:rPr>
+        <w:t xml:space="preserve"> (usually </w:t>
+      </w:r>
+      <w:r>
+        <w:rPr>
+          <w:rFonts w:ascii="Courier New" w:hAnsi="Courier New" w:eastAsia="Courier New"/>
+          <w:b w:val="0"/>
+          <w:color w:val="C2560B"/>
+          <w:sz w:val="19"/>
+        </w:rPr>
+        <w:t>enp0s8</w:t>
+      </w:r>
+      <w:r>
+        <w:rPr>
+          <w:b w:val="0"/>
+          <w:sz w:val="21"/>
+        </w:rPr>
+        <w:t>). Then run, on node1:</w:t>
+      </w:r>
+    </w:p>
+    <w:tbl>
+      <w:tblPr>
+        <w:tblW w:type="auto" w:w="0"/>
+        <w:tblLook w:firstColumn="1" w:firstRow="1" w:lastColumn="0" w:lastRow="0" w:noHBand="0" w:noVBand="1" w:val="04A0"/>
+        <w:tblInd w:w="604" w:type="dxa"/>
+        <w:tblBorders>
+          <w:top w:val="single" w:sz="4" w:space="0" w:color="D9D9D9"/>
+          <w:left w:val="single" w:sz="4" w:space="0" w:color="D9D9D9"/>
+          <w:bottom w:val="single" w:sz="4" w:space="0" w:color="D9D9D9"/>
+          <w:right w:val="single" w:sz="4" w:space="0" w:color="D9D9D9"/>
+          <w:insideH w:val="single" w:sz="4" w:space="0" w:color="D9D9D9"/>
+          <w:insideV w:val="single" w:sz="4" w:space="0" w:color="D9D9D9"/>
+        </w:tblBorders>
+        <w:tblW w:w="9000" w:type="dxa"/>
+        <w:tblLayout w:type="fixed"/>
+      </w:tblPr>
+      <w:tblGrid>
+        <w:gridCol w:w="9000"/>
+      </w:tblGrid>
+      <w:tr>
+        <w:trPr>
+          <w:cantSplit/>
+        </w:trPr>
+        <w:tc>
+          <w:tcPr>
+            <w:tcW w:type="dxa" w:w="9605"/>
+            <w:tcW w:w="9000" w:type="dxa"/>
+            <w:shd w:val="clear" w:color="auto" w:fill="F6F6F6"/>
+          </w:tcPr>
+          <w:p>
+            <w:pPr>
+              <w:spacing w:before="0" w:after="0" w:line="240" w:lineRule="auto"/>
+            </w:pPr>
+            <w:r>
+              <w:rPr>
+                <w:rFonts w:ascii="Courier New" w:hAnsi="Courier New" w:eastAsia="Courier New"/>
+                <w:sz w:val="17"/>
+              </w:rPr>
+              <w:t>nmcli con add type ethernet ifname enp0s8 con-name lab ipv4.method manual ipv4.addresses 192.168.56.101/24</w:t>
+            </w:r>
+          </w:p>
+          <w:p>
+            <w:pPr>
+              <w:spacing w:before="0" w:after="0" w:line="240" w:lineRule="auto"/>
+            </w:pPr>
+            <w:r>
+              <w:rPr>
+                <w:rFonts w:ascii="Courier New" w:hAnsi="Courier New" w:eastAsia="Courier New"/>
+                <w:sz w:val="17"/>
+              </w:rPr>
+              <w:t>nmcli con up lab</w:t>
+            </w:r>
+          </w:p>
+        </w:tc>
+      </w:tr>
+    </w:tbl>
+    <w:p>
+      <w:pPr>
+        <w:spacing w:after="40"/>
+      </w:pPr>
+    </w:p>
+    <w:p>
+      <w:pPr>
+        <w:spacing w:before="0" w:after="100"/>
+        <w:ind w:left="605"/>
+      </w:pPr>
+      <w:r>
+        <w:rPr>
+          <w:b w:val="0"/>
+          <w:sz w:val="21"/>
+        </w:rPr>
+        <w:t xml:space="preserve">On node2, the same with </w:t>
+      </w:r>
+      <w:r>
+        <w:rPr>
+          <w:rFonts w:ascii="Courier New" w:hAnsi="Courier New" w:eastAsia="Courier New"/>
+          <w:b w:val="0"/>
+          <w:color w:val="C2560B"/>
+          <w:sz w:val="19"/>
+        </w:rPr>
+        <w:t>192.168.56.102/24</w:t>
+      </w:r>
+      <w:r>
+        <w:rPr>
+          <w:b w:val="0"/>
+          <w:sz w:val="21"/>
+        </w:rPr>
+        <w:t xml:space="preserve">. Don't set a gateway or DNS on this connection: the NAT adapter already provides both. If </w:t>
+      </w:r>
+      <w:r>
+        <w:rPr>
+          <w:rFonts w:ascii="Courier New" w:hAnsi="Courier New" w:eastAsia="Courier New"/>
+          <w:b w:val="0"/>
+          <w:color w:val="C2560B"/>
+          <w:sz w:val="19"/>
+        </w:rPr>
+        <w:t>nmcli con show</w:t>
+      </w:r>
+      <w:r>
+        <w:rPr>
+          <w:b w:val="0"/>
+          <w:sz w:val="21"/>
+        </w:rPr>
+        <w:t xml:space="preserve"> already lists a connection for </w:t>
+      </w:r>
+      <w:r>
+        <w:rPr>
+          <w:rFonts w:ascii="Courier New" w:hAnsi="Courier New" w:eastAsia="Courier New"/>
+          <w:b w:val="0"/>
+          <w:color w:val="C2560B"/>
+          <w:sz w:val="19"/>
+        </w:rPr>
+        <w:t>enp0s8</w:t>
+      </w:r>
+      <w:r>
+        <w:rPr>
+          <w:b w:val="0"/>
+          <w:sz w:val="21"/>
+        </w:rPr>
+        <w:t xml:space="preserve">, delete it first with </w:t>
+      </w:r>
+      <w:r>
+        <w:rPr>
+          <w:rFonts w:ascii="Courier New" w:hAnsi="Courier New" w:eastAsia="Courier New"/>
+          <w:b w:val="0"/>
+          <w:color w:val="C2560B"/>
+          <w:sz w:val="19"/>
+        </w:rPr>
+        <w:t>nmcli con delete "&lt;its name&gt;"</w:t>
+      </w:r>
+      <w:r>
+        <w:rPr>
+          <w:b w:val="0"/>
+          <w:sz w:val="21"/>
+        </w:rPr>
+        <w:t xml:space="preserve">. Then, from node1, </w:t>
+      </w:r>
+      <w:r>
+        <w:rPr>
+          <w:rFonts w:ascii="Courier New" w:hAnsi="Courier New" w:eastAsia="Courier New"/>
+          <w:b w:val="0"/>
+          <w:color w:val="C2560B"/>
+          <w:sz w:val="19"/>
+        </w:rPr>
+        <w:t>ping -c2 192.168.56.102</w:t>
+      </w:r>
+      <w:r>
+        <w:rPr>
+          <w:b w:val="0"/>
+          <w:sz w:val="21"/>
+        </w:rPr>
+        <w:t xml:space="preserve"> must work.</w:t>
+      </w:r>
+    </w:p>
+    <w:p>
+      <w:pPr>
+        <w:keepNext w:val="0"/>
+        <w:tabs>
+          <w:tab w:pos="605" w:val="left"/>
+        </w:tabs>
+        <w:spacing w:before="120" w:after="60"/>
+        <w:ind w:left="605" w:hanging="605"/>
+      </w:pPr>
+      <w:r>
+        <w:rPr>
+          <w:b/>
+          <w:sz w:val="21"/>
+        </w:rPr>
+        <w:t>5.</w:t>
+        <w:tab/>
+      </w:r>
+      <w:r>
+        <w:rPr>
+          <w:b/>
+          <w:sz w:val="21"/>
+        </w:rPr>
+        <w:t>Attach the ISO to both VMs:</w:t>
+      </w:r>
+      <w:r>
+        <w:rPr>
+          <w:b w:val="0"/>
+          <w:sz w:val="21"/>
+        </w:rPr>
+        <w:t xml:space="preserve"> Settings → Storage → the empty optical drive → choose the RHEL 9 DVD ISO.</w:t>
+      </w:r>
+    </w:p>
+    <w:p>
+      <w:pPr>
+        <w:keepNext w:val="0"/>
+        <w:tabs>
+          <w:tab w:pos="605" w:val="left"/>
+        </w:tabs>
+        <w:spacing w:before="120" w:after="60"/>
+        <w:ind w:left="605" w:hanging="605"/>
+      </w:pPr>
+      <w:r>
+        <w:rPr>
+          <w:b/>
+          <w:sz w:val="21"/>
+        </w:rPr>
+        <w:t>6.</w:t>
+        <w:tab/>
+      </w:r>
+      <w:r>
+        <w:rPr>
+          <w:b/>
+          <w:sz w:val="21"/>
+        </w:rPr>
+        <w:t>Check internet on node1:</w:t>
+      </w:r>
+      <w:r>
+        <w:rPr>
+          <w:b w:val="0"/>
+          <w:sz w:val="21"/>
+        </w:rPr>
+        <w:t xml:space="preserve"> </w:t>
+      </w:r>
+      <w:r>
+        <w:rPr>
+          <w:rFonts w:ascii="Courier New" w:hAnsi="Courier New" w:eastAsia="Courier New"/>
+          <w:b w:val="0"/>
+          <w:color w:val="C2560B"/>
+          <w:sz w:val="19"/>
+        </w:rPr>
+        <w:t>ping -c2 8.8.8.8 &amp;&amp; getent hosts registry.access.redhat.com</w:t>
+      </w:r>
+      <w:r>
+        <w:rPr>
+          <w:b w:val="0"/>
+          <w:sz w:val="21"/>
+        </w:rPr>
+        <w:t xml:space="preserve"> must print replies and an address. If </w:t>
+      </w:r>
+      <w:r>
+        <w:rPr>
+          <w:rFonts w:ascii="Courier New" w:hAnsi="Courier New" w:eastAsia="Courier New"/>
+          <w:b w:val="0"/>
+          <w:color w:val="C2560B"/>
+          <w:sz w:val="19"/>
+        </w:rPr>
+        <w:t>getent</w:t>
+      </w:r>
+      <w:r>
+        <w:rPr>
+          <w:b w:val="0"/>
+          <w:sz w:val="21"/>
+        </w:rPr>
+        <w:t xml:space="preserve"> prints nothing, run </w:t>
+      </w:r>
+      <w:r>
+        <w:rPr>
+          <w:rFonts w:ascii="Courier New" w:hAnsi="Courier New" w:eastAsia="Courier New"/>
+          <w:b w:val="0"/>
+          <w:color w:val="C2560B"/>
+          <w:sz w:val="19"/>
+        </w:rPr>
+        <w:t>echo "nameserver 8.8.8.8" &gt;&gt; /etc/resolv.conf</w:t>
+      </w:r>
+      <w:r>
+        <w:rPr>
+          <w:b w:val="0"/>
+          <w:sz w:val="21"/>
+        </w:rPr>
+        <w:t xml:space="preserve"> and test again.</w:t>
+      </w:r>
+    </w:p>
+    <w:p>
+      <w:pPr>
+        <w:keepNext w:val="0"/>
+        <w:tabs>
+          <w:tab w:pos="605" w:val="left"/>
+        </w:tabs>
+        <w:spacing w:before="120" w:after="60"/>
+        <w:ind w:left="605" w:hanging="605"/>
+      </w:pPr>
+      <w:r>
+        <w:rPr>
+          <w:b/>
+          <w:sz w:val="21"/>
+        </w:rPr>
+        <w:t>7.</w:t>
+        <w:tab/>
+      </w:r>
+      <w:r>
+        <w:rPr>
+          <w:b/>
+          <w:sz w:val="21"/>
+        </w:rPr>
+        <w:t>Copy the grader into both VMs now,</w:t>
+      </w:r>
+      <w:r>
+        <w:rPr>
+          <w:b w:val="0"/>
+          <w:sz w:val="21"/>
+        </w:rPr>
+        <w:t xml:space="preserve"> before the exam (Appendix B). After task 19 changes SSH, this is harder.</w:t>
+      </w:r>
+    </w:p>
+    <w:p>
+      <w:pPr>
+        <w:keepNext w:val="0"/>
+        <w:tabs>
+          <w:tab w:pos="605" w:val="left"/>
+        </w:tabs>
+        <w:spacing w:before="120" w:after="60"/>
+        <w:ind w:left="605" w:hanging="605"/>
+      </w:pPr>
+      <w:r>
+        <w:rPr>
+          <w:b/>
+          <w:sz w:val="21"/>
+        </w:rPr>
+        <w:t>8.</w:t>
+        <w:tab/>
+      </w:r>
+      <w:r>
+        <w:rPr>
+          <w:b/>
+          <w:sz w:val="21"/>
+        </w:rPr>
+        <w:t>Shut down both VMs and take a snapshot of each</w:t>
+      </w:r>
+      <w:r>
+        <w:rPr>
+          <w:b w:val="0"/>
+          <w:sz w:val="21"/>
+        </w:rPr>
+        <w:t xml:space="preserve"> (Machine → Take Snapshot), named </w:t>
+      </w:r>
+      <w:r>
+        <w:rPr>
+          <w:rFonts w:ascii="Courier New" w:hAnsi="Courier New" w:eastAsia="Courier New"/>
+          <w:b w:val="0"/>
+          <w:color w:val="C2560B"/>
+          <w:sz w:val="19"/>
+        </w:rPr>
+        <w:t>start</w:t>
+      </w:r>
+      <w:r>
+        <w:rPr>
+          <w:b w:val="0"/>
+          <w:sz w:val="21"/>
+        </w:rPr>
+        <w:t xml:space="preserve">. To retake the exam later, restore </w:t>
+      </w:r>
+      <w:r>
+        <w:rPr>
+          <w:rFonts w:ascii="Courier New" w:hAnsi="Courier New" w:eastAsia="Courier New"/>
+          <w:b w:val="0"/>
+          <w:color w:val="C2560B"/>
+          <w:sz w:val="19"/>
+        </w:rPr>
+        <w:t>start</w:t>
+      </w:r>
+      <w:r>
+        <w:rPr>
+          <w:b w:val="0"/>
+          <w:sz w:val="21"/>
+        </w:rPr>
+        <w:t xml:space="preserve"> on both.</w:t>
+      </w:r>
+    </w:p>
+    <w:p>
+      <w:pPr>
+        <w:pStyle w:val="Heading2"/>
+        <w:spacing w:before="280" w:after="120"/>
+        <w:pBdr>
+          <w:bottom w:val="single" w:sz="6" w:space="1" w:color="E0E0E0"/>
+        </w:pBdr>
+      </w:pPr>
+      <w:r>
+        <w:rPr>
+          <w:b/>
+          <w:color w:val="000000"/>
+          <w:sz w:val="27"/>
+        </w:rPr>
+        <w:t>Appendix B — Get the grader into the VMs</w:t>
+      </w:r>
+    </w:p>
+    <w:p>
+      <w:pPr>
+        <w:spacing w:before="0" w:after="100"/>
+        <w:ind w:left="0"/>
+      </w:pPr>
+      <w:r>
+        <w:rPr>
+          <w:b w:val="0"/>
+          <w:sz w:val="21"/>
+        </w:rPr>
+        <w:t xml:space="preserve">You received the grader as a file, </w:t>
+      </w:r>
+      <w:r>
+        <w:rPr>
+          <w:rFonts w:ascii="Courier New" w:hAnsi="Courier New" w:eastAsia="Courier New"/>
+          <w:b w:val="0"/>
+          <w:color w:val="C2560B"/>
+          <w:sz w:val="19"/>
+        </w:rPr>
+        <w:t>rhcsa9-mock-1-grade.sh</w:t>
+      </w:r>
+      <w:r>
+        <w:rPr>
+          <w:b w:val="0"/>
+          <w:sz w:val="21"/>
+        </w:rPr>
+        <w:t>. Pick one method.</w:t>
+      </w:r>
+    </w:p>
+    <w:p>
+      <w:pPr>
+        <w:spacing w:before="0" w:after="100"/>
+        <w:ind w:left="0"/>
+      </w:pPr>
+      <w:r>
+        <w:rPr>
+          <w:b/>
+          <w:sz w:val="21"/>
+        </w:rPr>
+        <w:t>Method 1: from Windows with Python</w:t>
+      </w:r>
+      <w:r>
+        <w:rPr>
+          <w:b w:val="0"/>
+          <w:sz w:val="21"/>
+        </w:rPr>
+        <w:t xml:space="preserve"> (the easiest; it needs Python, e.g. </w:t>
+      </w:r>
+      <w:r>
+        <w:rPr>
+          <w:rFonts w:ascii="Courier New" w:hAnsi="Courier New" w:eastAsia="Courier New"/>
+          <w:b w:val="0"/>
+          <w:color w:val="C2560B"/>
+          <w:sz w:val="19"/>
+        </w:rPr>
+        <w:t>winget install Python.Python.3.12</w:t>
+      </w:r>
+      <w:r>
+        <w:rPr>
+          <w:b w:val="0"/>
+          <w:sz w:val="21"/>
+        </w:rPr>
+        <w:t>). In the folder holding the grader, open a terminal and run:</w:t>
       </w:r>
     </w:p>
     <w:tbl>
@@ -2650,7 +4191,98 @@
                 <w:rFonts w:ascii="Courier New" w:hAnsi="Courier New" w:eastAsia="Courier New"/>
                 <w:sz w:val="17"/>
               </w:rPr>
-              <w:t># edit NODE1_IP / NODE2_IP (and the disk names, if yours differ) at the top of the grader first</w:t>
+              <w:t>python -m http.server 8000 --bind 127.0.0.1</w:t>
+            </w:r>
+          </w:p>
+        </w:tc>
+      </w:tr>
+    </w:tbl>
+    <w:p>
+      <w:pPr>
+        <w:spacing w:after="40"/>
+      </w:pPr>
+    </w:p>
+    <w:p>
+      <w:pPr>
+        <w:spacing w:before="0" w:after="100"/>
+        <w:ind w:left="0"/>
+      </w:pPr>
+      <w:r>
+        <w:rPr>
+          <w:b w:val="0"/>
+          <w:sz w:val="21"/>
+        </w:rPr>
+        <w:t xml:space="preserve">Then in </w:t>
+      </w:r>
+      <w:r>
+        <w:rPr>
+          <w:b/>
+          <w:sz w:val="21"/>
+        </w:rPr>
+        <w:t>each</w:t>
+      </w:r>
+      <w:r>
+        <w:rPr>
+          <w:b w:val="0"/>
+          <w:sz w:val="21"/>
+        </w:rPr>
+        <w:t xml:space="preserve"> VM, as root (VirtualBox's NAT lets the VM reach your PC at </w:t>
+      </w:r>
+      <w:r>
+        <w:rPr>
+          <w:rFonts w:ascii="Courier New" w:hAnsi="Courier New" w:eastAsia="Courier New"/>
+          <w:b w:val="0"/>
+          <w:color w:val="C2560B"/>
+          <w:sz w:val="19"/>
+        </w:rPr>
+        <w:t>10.0.2.2</w:t>
+      </w:r>
+      <w:r>
+        <w:rPr>
+          <w:b w:val="0"/>
+          <w:sz w:val="21"/>
+        </w:rPr>
+        <w:t>):</w:t>
+      </w:r>
+    </w:p>
+    <w:tbl>
+      <w:tblPr>
+        <w:tblW w:type="auto" w:w="0"/>
+        <w:tblLook w:firstColumn="1" w:firstRow="1" w:lastColumn="0" w:lastRow="0" w:noHBand="0" w:noVBand="1" w:val="04A0"/>
+        <w:tblBorders>
+          <w:top w:val="single" w:sz="4" w:space="0" w:color="D9D9D9"/>
+          <w:left w:val="single" w:sz="4" w:space="0" w:color="D9D9D9"/>
+          <w:bottom w:val="single" w:sz="4" w:space="0" w:color="D9D9D9"/>
+          <w:right w:val="single" w:sz="4" w:space="0" w:color="D9D9D9"/>
+          <w:insideH w:val="single" w:sz="4" w:space="0" w:color="D9D9D9"/>
+          <w:insideV w:val="single" w:sz="4" w:space="0" w:color="D9D9D9"/>
+        </w:tblBorders>
+        <w:tblW w:w="9604" w:type="dxa"/>
+        <w:tblLayout w:type="fixed"/>
+      </w:tblPr>
+      <w:tblGrid>
+        <w:gridCol w:w="9604"/>
+      </w:tblGrid>
+      <w:tr>
+        <w:trPr>
+          <w:cantSplit/>
+        </w:trPr>
+        <w:tc>
+          <w:tcPr>
+            <w:tcW w:type="dxa" w:w="9605"/>
+            <w:tcW w:w="9604" w:type="dxa"/>
+            <w:shd w:val="clear" w:color="auto" w:fill="F6F6F6"/>
+          </w:tcPr>
+          <w:p>
+            <w:pPr>
+              <w:spacing w:before="0" w:after="0" w:line="240" w:lineRule="auto"/>
+            </w:pPr>
+            <w:r>
+              <w:rPr>
+                <w:rFonts w:ascii="Courier New" w:hAnsi="Courier New" w:eastAsia="Courier New"/>
+                <w:sz w:val="17"/>
+              </w:rPr>
+              <w:t>curl -o /root/grade.sh http://10.0.2.2:8000/rhcsa9-mock-1-grade.sh</w:t>
             </w:r>
           </w:p>
           <w:p>
@@ -2662,9 +4294,158 @@
                 <w:rFonts w:ascii="Courier New" w:hAnsi="Courier New" w:eastAsia="Courier New"/>
                 <w:sz w:val="17"/>
               </w:rPr>
-              <w:t>bash rhcsa9-mock-1-grade.sh          # on node1, then on node2</w:t>
+              <w:t>head -1 /root/grade.sh          # must print #!/bin/bash</w:t>
             </w:r>
           </w:p>
+        </w:tc>
+      </w:tr>
+    </w:tbl>
+    <w:p>
+      <w:pPr>
+        <w:spacing w:after="40"/>
+      </w:pPr>
+    </w:p>
+    <w:p>
+      <w:pPr>
+        <w:spacing w:before="0" w:after="100"/>
+        <w:ind w:left="0"/>
+      </w:pPr>
+      <w:r>
+        <w:rPr>
+          <w:b w:val="0"/>
+          <w:sz w:val="21"/>
+        </w:rPr>
+        <w:t xml:space="preserve">Stop the server with </w:t>
+      </w:r>
+      <w:r>
+        <w:rPr>
+          <w:rFonts w:ascii="Courier New" w:hAnsi="Courier New" w:eastAsia="Courier New"/>
+          <w:b w:val="0"/>
+          <w:color w:val="C2560B"/>
+          <w:sz w:val="19"/>
+        </w:rPr>
+        <w:t>Ctrl+C</w:t>
+      </w:r>
+      <w:r>
+        <w:rPr>
+          <w:b w:val="0"/>
+          <w:sz w:val="21"/>
+        </w:rPr>
+        <w:t xml:space="preserve"> when both VMs have the file.</w:t>
+      </w:r>
+    </w:p>
+    <w:p>
+      <w:pPr>
+        <w:spacing w:before="0" w:after="100"/>
+        <w:ind w:left="0"/>
+      </w:pPr>
+      <w:r>
+        <w:rPr>
+          <w:b/>
+          <w:sz w:val="21"/>
+        </w:rPr>
+        <w:t>Method 2: scp from Windows.</w:t>
+      </w:r>
+      <w:r>
+        <w:rPr>
+          <w:b w:val="0"/>
+          <w:sz w:val="21"/>
+        </w:rPr>
+        <w:t xml:space="preserve"> In VirtualBox, open the VM's Settings → Network → Adapter 1 → Port Forwarding, and add a rule: protocol TCP, host IP </w:t>
+      </w:r>
+      <w:r>
+        <w:rPr>
+          <w:rFonts w:ascii="Courier New" w:hAnsi="Courier New" w:eastAsia="Courier New"/>
+          <w:b w:val="0"/>
+          <w:color w:val="C2560B"/>
+          <w:sz w:val="19"/>
+        </w:rPr>
+        <w:t>127.0.0.1</w:t>
+      </w:r>
+      <w:r>
+        <w:rPr>
+          <w:b w:val="0"/>
+          <w:sz w:val="21"/>
+        </w:rPr>
+        <w:t xml:space="preserve">, host port </w:t>
+      </w:r>
+      <w:r>
+        <w:rPr>
+          <w:rFonts w:ascii="Courier New" w:hAnsi="Courier New" w:eastAsia="Courier New"/>
+          <w:b w:val="0"/>
+          <w:color w:val="C2560B"/>
+          <w:sz w:val="19"/>
+        </w:rPr>
+        <w:t>2201</w:t>
+      </w:r>
+      <w:r>
+        <w:rPr>
+          <w:b w:val="0"/>
+          <w:sz w:val="21"/>
+        </w:rPr>
+        <w:t xml:space="preserve"> (use </w:t>
+      </w:r>
+      <w:r>
+        <w:rPr>
+          <w:rFonts w:ascii="Courier New" w:hAnsi="Courier New" w:eastAsia="Courier New"/>
+          <w:b w:val="0"/>
+          <w:color w:val="C2560B"/>
+          <w:sz w:val="19"/>
+        </w:rPr>
+        <w:t>2202</w:t>
+      </w:r>
+      <w:r>
+        <w:rPr>
+          <w:b w:val="0"/>
+          <w:sz w:val="21"/>
+        </w:rPr>
+        <w:t xml:space="preserve"> for node2), guest port </w:t>
+      </w:r>
+      <w:r>
+        <w:rPr>
+          <w:rFonts w:ascii="Courier New" w:hAnsi="Courier New" w:eastAsia="Courier New"/>
+          <w:b w:val="0"/>
+          <w:color w:val="C2560B"/>
+          <w:sz w:val="19"/>
+        </w:rPr>
+        <w:t>22</w:t>
+      </w:r>
+      <w:r>
+        <w:rPr>
+          <w:b w:val="0"/>
+          <w:sz w:val="21"/>
+        </w:rPr>
+        <w:t>. Then, in PowerShell, from the grader's folder:</w:t>
+      </w:r>
+    </w:p>
+    <w:tbl>
+      <w:tblPr>
+        <w:tblW w:type="auto" w:w="0"/>
+        <w:tblLook w:firstColumn="1" w:firstRow="1" w:lastColumn="0" w:lastRow="0" w:noHBand="0" w:noVBand="1" w:val="04A0"/>
+        <w:tblBorders>
+          <w:top w:val="single" w:sz="4" w:space="0" w:color="D9D9D9"/>
+          <w:left w:val="single" w:sz="4" w:space="0" w:color="D9D9D9"/>
+          <w:bottom w:val="single" w:sz="4" w:space="0" w:color="D9D9D9"/>
+          <w:right w:val="single" w:sz="4" w:space="0" w:color="D9D9D9"/>
+          <w:insideH w:val="single" w:sz="4" w:space="0" w:color="D9D9D9"/>
+          <w:insideV w:val="single" w:sz="4" w:space="0" w:color="D9D9D9"/>
+        </w:tblBorders>
+        <w:tblW w:w="9604" w:type="dxa"/>
+        <w:tblLayout w:type="fixed"/>
+      </w:tblPr>
+      <w:tblGrid>
+        <w:gridCol w:w="9604"/>
+      </w:tblGrid>
+      <w:tr>
+        <w:trPr>
+          <w:cantSplit/>
+        </w:trPr>
+        <w:tc>
+          <w:tcPr>
+            <w:tcW w:type="dxa" w:w="9605"/>
+            <w:tcW w:w="9604" w:type="dxa"/>
+            <w:shd w:val="clear" w:color="auto" w:fill="F6F6F6"/>
+          </w:tcPr>
           <w:p>
             <w:pPr>
               <w:spacing w:before="0" w:after="0" w:line="240" w:lineRule="auto"/>
@@ -2674,7 +4455,7 @@
                 <w:rFonts w:ascii="Courier New" w:hAnsi="Courier New" w:eastAsia="Courier New"/>
                 <w:sz w:val="17"/>
               </w:rPr>
-              <w:t>bash rhcsa9-mock-1-grade.sh --all    # or, from node1, if root on node1 has an SSH key into node2</w:t>
+              <w:t>scp -P 2201 rhcsa9-mock-1-grade.sh &lt;your-user&gt;@127.0.0.1:/tmp/grade.sh</w:t>
             </w:r>
           </w:p>
         </w:tc>
@@ -2684,6 +4465,516 @@
       <w:pPr>
         <w:spacing w:after="40"/>
       </w:pPr>
+    </w:p>
+    <w:p>
+      <w:pPr>
+        <w:spacing w:before="0" w:after="100"/>
+        <w:ind w:left="0"/>
+      </w:pPr>
+      <w:r>
+        <w:rPr>
+          <w:b w:val="0"/>
+          <w:sz w:val="21"/>
+        </w:rPr>
+        <w:t xml:space="preserve">In the VM, run </w:t>
+      </w:r>
+      <w:r>
+        <w:rPr>
+          <w:rFonts w:ascii="Courier New" w:hAnsi="Courier New" w:eastAsia="Courier New"/>
+          <w:b w:val="0"/>
+          <w:color w:val="C2560B"/>
+          <w:sz w:val="19"/>
+        </w:rPr>
+        <w:t>sudo cp /tmp/grade.sh /root/grade.sh</w:t>
+      </w:r>
+      <w:r>
+        <w:rPr>
+          <w:b w:val="0"/>
+          <w:sz w:val="21"/>
+        </w:rPr>
+        <w:t>.</w:t>
+      </w:r>
+    </w:p>
+    <w:p>
+      <w:pPr>
+        <w:spacing w:before="0" w:after="100"/>
+        <w:ind w:left="0"/>
+      </w:pPr>
+      <w:r>
+        <w:rPr>
+          <w:b/>
+          <w:sz w:val="21"/>
+        </w:rPr>
+        <w:t xml:space="preserve">If the grader prints </w:t>
+      </w:r>
+      <w:r>
+        <w:rPr>
+          <w:rFonts w:ascii="Courier New" w:hAnsi="Courier New" w:eastAsia="Courier New"/>
+          <w:b/>
+          <w:color w:val="C2560B"/>
+          <w:sz w:val="19"/>
+        </w:rPr>
+        <w:t>$'\r': command not found</w:t>
+      </w:r>
+      <w:r>
+        <w:rPr>
+          <w:b/>
+          <w:sz w:val="21"/>
+        </w:rPr>
+        <w:t>,</w:t>
+      </w:r>
+      <w:r>
+        <w:rPr>
+          <w:b w:val="0"/>
+          <w:sz w:val="21"/>
+        </w:rPr>
+        <w:t xml:space="preserve"> the file picked up Windows line endings on the way. Fix it with </w:t>
+      </w:r>
+      <w:r>
+        <w:rPr>
+          <w:rFonts w:ascii="Courier New" w:hAnsi="Courier New" w:eastAsia="Courier New"/>
+          <w:b w:val="0"/>
+          <w:color w:val="C2560B"/>
+          <w:sz w:val="19"/>
+        </w:rPr>
+        <w:t>sed -i 's/\r$//' /root/grade.sh</w:t>
+      </w:r>
+      <w:r>
+        <w:rPr>
+          <w:b w:val="0"/>
+          <w:sz w:val="21"/>
+        </w:rPr>
+        <w:t xml:space="preserve"> and run it again.</w:t>
+      </w:r>
+    </w:p>
+    <w:p>
+      <w:pPr>
+        <w:spacing w:before="0" w:after="100"/>
+        <w:ind w:left="0"/>
+      </w:pPr>
+      <w:r>
+        <w:rPr>
+          <w:b/>
+          <w:sz w:val="21"/>
+        </w:rPr>
+        <w:t>Don't read the grader before the exam:</w:t>
+      </w:r>
+      <w:r>
+        <w:rPr>
+          <w:b w:val="0"/>
+          <w:sz w:val="21"/>
+        </w:rPr>
+        <w:t xml:space="preserve"> its checks give the answers away.</w:t>
+      </w:r>
+    </w:p>
+    <w:p>
+      <w:pPr>
+        <w:pStyle w:val="Heading2"/>
+        <w:spacing w:before="280" w:after="120"/>
+        <w:pBdr>
+          <w:bottom w:val="single" w:sz="6" w:space="1" w:color="E0E0E0"/>
+        </w:pBdr>
+      </w:pPr>
+      <w:r>
+        <w:rPr>
+          <w:b/>
+          <w:color w:val="000000"/>
+          <w:sz w:val="27"/>
+        </w:rPr>
+        <w:t>Appendix C — Grade your attempt</w:t>
+      </w:r>
+    </w:p>
+    <w:p>
+      <w:pPr>
+        <w:keepNext w:val="0"/>
+        <w:tabs>
+          <w:tab w:pos="605" w:val="left"/>
+        </w:tabs>
+        <w:spacing w:before="120" w:after="60"/>
+        <w:ind w:left="605" w:hanging="605"/>
+      </w:pPr>
+      <w:r>
+        <w:rPr>
+          <w:b/>
+          <w:sz w:val="21"/>
+        </w:rPr>
+        <w:t>1.</w:t>
+        <w:tab/>
+      </w:r>
+      <w:r>
+        <w:rPr>
+          <w:b/>
+          <w:sz w:val="21"/>
+        </w:rPr>
+        <w:t>Reboot node2, then node1.</w:t>
+      </w:r>
+      <w:r>
+        <w:rPr>
+          <w:b w:val="0"/>
+          <w:sz w:val="21"/>
+        </w:rPr>
+        <w:t xml:space="preserve"> Only work that survives a reboot counts.</w:t>
+      </w:r>
+    </w:p>
+    <w:p>
+      <w:pPr>
+        <w:keepNext w:val="0"/>
+        <w:tabs>
+          <w:tab w:pos="605" w:val="left"/>
+        </w:tabs>
+        <w:spacing w:before="120" w:after="60"/>
+        <w:ind w:left="605" w:hanging="605"/>
+      </w:pPr>
+      <w:r>
+        <w:rPr>
+          <w:b/>
+          <w:sz w:val="21"/>
+        </w:rPr>
+        <w:t>2.</w:t>
+        <w:tab/>
+      </w:r>
+      <w:r>
+        <w:rPr>
+          <w:b/>
+          <w:sz w:val="21"/>
+        </w:rPr>
+        <w:t>On each node, as root,</w:t>
+      </w:r>
+      <w:r>
+        <w:rPr>
+          <w:b w:val="0"/>
+          <w:sz w:val="21"/>
+        </w:rPr>
+        <w:t xml:space="preserve"> run the grader with your two IP addresses:</w:t>
+      </w:r>
+    </w:p>
+    <w:tbl>
+      <w:tblPr>
+        <w:tblW w:type="auto" w:w="0"/>
+        <w:tblLook w:firstColumn="1" w:firstRow="1" w:lastColumn="0" w:lastRow="0" w:noHBand="0" w:noVBand="1" w:val="04A0"/>
+        <w:tblInd w:w="604" w:type="dxa"/>
+        <w:tblBorders>
+          <w:top w:val="single" w:sz="4" w:space="0" w:color="D9D9D9"/>
+          <w:left w:val="single" w:sz="4" w:space="0" w:color="D9D9D9"/>
+          <w:bottom w:val="single" w:sz="4" w:space="0" w:color="D9D9D9"/>
+          <w:right w:val="single" w:sz="4" w:space="0" w:color="D9D9D9"/>
+          <w:insideH w:val="single" w:sz="4" w:space="0" w:color="D9D9D9"/>
+          <w:insideV w:val="single" w:sz="4" w:space="0" w:color="D9D9D9"/>
+        </w:tblBorders>
+        <w:tblW w:w="9000" w:type="dxa"/>
+        <w:tblLayout w:type="fixed"/>
+      </w:tblPr>
+      <w:tblGrid>
+        <w:gridCol w:w="9000"/>
+      </w:tblGrid>
+      <w:tr>
+        <w:trPr>
+          <w:cantSplit/>
+        </w:trPr>
+        <w:tc>
+          <w:tcPr>
+            <w:tcW w:type="dxa" w:w="9605"/>
+            <w:tcW w:w="9000" w:type="dxa"/>
+            <w:shd w:val="clear" w:color="auto" w:fill="F6F6F6"/>
+          </w:tcPr>
+          <w:p>
+            <w:pPr>
+              <w:spacing w:before="0" w:after="0" w:line="240" w:lineRule="auto"/>
+            </w:pPr>
+            <w:r>
+              <w:rPr>
+                <w:rFonts w:ascii="Courier New" w:hAnsi="Courier New" w:eastAsia="Courier New"/>
+                <w:sz w:val="17"/>
+              </w:rPr>
+              <w:t>NODE1_IP=192.168.56.101 NODE2_IP=192.168.56.102 bash /root/grade.sh</w:t>
+            </w:r>
+          </w:p>
+        </w:tc>
+      </w:tr>
+    </w:tbl>
+    <w:p>
+      <w:pPr>
+        <w:spacing w:after="40"/>
+      </w:pPr>
+    </w:p>
+    <w:p>
+      <w:pPr>
+        <w:spacing w:before="0" w:after="100"/>
+        <w:ind w:left="605"/>
+      </w:pPr>
+      <w:r>
+        <w:rPr>
+          <w:b w:val="0"/>
+          <w:sz w:val="21"/>
+        </w:rPr>
+        <w:t xml:space="preserve">If your disks aren't </w:t>
+      </w:r>
+      <w:r>
+        <w:rPr>
+          <w:rFonts w:ascii="Courier New" w:hAnsi="Courier New" w:eastAsia="Courier New"/>
+          <w:b w:val="0"/>
+          <w:color w:val="C2560B"/>
+          <w:sz w:val="19"/>
+        </w:rPr>
+        <w:t>sdb</w:t>
+      </w:r>
+      <w:r>
+        <w:rPr>
+          <w:b w:val="0"/>
+          <w:sz w:val="21"/>
+        </w:rPr>
+        <w:t xml:space="preserve">, </w:t>
+      </w:r>
+      <w:r>
+        <w:rPr>
+          <w:rFonts w:ascii="Courier New" w:hAnsi="Courier New" w:eastAsia="Courier New"/>
+          <w:b w:val="0"/>
+          <w:color w:val="C2560B"/>
+          <w:sz w:val="19"/>
+        </w:rPr>
+        <w:t>sdc</w:t>
+      </w:r>
+      <w:r>
+        <w:rPr>
+          <w:b w:val="0"/>
+          <w:sz w:val="21"/>
+        </w:rPr>
+        <w:t xml:space="preserve"> and </w:t>
+      </w:r>
+      <w:r>
+        <w:rPr>
+          <w:rFonts w:ascii="Courier New" w:hAnsi="Courier New" w:eastAsia="Courier New"/>
+          <w:b w:val="0"/>
+          <w:color w:val="C2560B"/>
+          <w:sz w:val="19"/>
+        </w:rPr>
+        <w:t>sdd</w:t>
+      </w:r>
+      <w:r>
+        <w:rPr>
+          <w:b w:val="0"/>
+          <w:sz w:val="21"/>
+        </w:rPr>
+        <w:t xml:space="preserve">, add </w:t>
+      </w:r>
+      <w:r>
+        <w:rPr>
+          <w:rFonts w:ascii="Courier New" w:hAnsi="Courier New" w:eastAsia="Courier New"/>
+          <w:b w:val="0"/>
+          <w:color w:val="C2560B"/>
+          <w:sz w:val="19"/>
+        </w:rPr>
+        <w:t>XDISK=… THINDISK=… SWAPDISK=…</w:t>
+      </w:r>
+      <w:r>
+        <w:rPr>
+          <w:b w:val="0"/>
+          <w:sz w:val="21"/>
+        </w:rPr>
+        <w:t xml:space="preserve"> in front, the same way. The grader only reads the system: it changes nothing, and you can run it as often as you like.</w:t>
+      </w:r>
+    </w:p>
+    <w:p>
+      <w:pPr>
+        <w:keepNext w:val="0"/>
+        <w:tabs>
+          <w:tab w:pos="605" w:val="left"/>
+        </w:tabs>
+        <w:spacing w:before="120" w:after="60"/>
+        <w:ind w:left="605" w:hanging="605"/>
+      </w:pPr>
+      <w:r>
+        <w:rPr>
+          <w:b/>
+          <w:sz w:val="21"/>
+        </w:rPr>
+        <w:t>3.</w:t>
+        <w:tab/>
+      </w:r>
+      <w:r>
+        <w:rPr>
+          <w:b/>
+          <w:sz w:val="21"/>
+        </w:rPr>
+        <w:t>Read the output.</w:t>
+      </w:r>
+      <w:r>
+        <w:rPr>
+          <w:b w:val="0"/>
+          <w:sz w:val="21"/>
+        </w:rPr>
+        <w:t xml:space="preserve"> Each task prints </w:t>
+      </w:r>
+      <w:r>
+        <w:rPr>
+          <w:rFonts w:ascii="Courier New" w:hAnsi="Courier New" w:eastAsia="Courier New"/>
+          <w:b w:val="0"/>
+          <w:color w:val="C2560B"/>
+          <w:sz w:val="19"/>
+        </w:rPr>
+        <w:t>PASS</w:t>
+      </w:r>
+      <w:r>
+        <w:rPr>
+          <w:b w:val="0"/>
+          <w:sz w:val="21"/>
+        </w:rPr>
+        <w:t xml:space="preserve"> or </w:t>
+      </w:r>
+      <w:r>
+        <w:rPr>
+          <w:rFonts w:ascii="Courier New" w:hAnsi="Courier New" w:eastAsia="Courier New"/>
+          <w:b w:val="0"/>
+          <w:color w:val="C2560B"/>
+          <w:sz w:val="19"/>
+        </w:rPr>
+        <w:t>FAIL</w:t>
+      </w:r>
+      <w:r>
+        <w:rPr>
+          <w:b w:val="0"/>
+          <w:sz w:val="21"/>
+        </w:rPr>
+        <w:t xml:space="preserve">. Under a </w:t>
+      </w:r>
+      <w:r>
+        <w:rPr>
+          <w:rFonts w:ascii="Courier New" w:hAnsi="Courier New" w:eastAsia="Courier New"/>
+          <w:b w:val="0"/>
+          <w:color w:val="C2560B"/>
+          <w:sz w:val="19"/>
+        </w:rPr>
+        <w:t>FAIL</w:t>
+      </w:r>
+      <w:r>
+        <w:rPr>
+          <w:b w:val="0"/>
+          <w:sz w:val="21"/>
+        </w:rPr>
+        <w:t xml:space="preserve">, every failed check has a </w:t>
+      </w:r>
+      <w:r>
+        <w:rPr>
+          <w:b/>
+          <w:sz w:val="21"/>
+        </w:rPr>
+        <w:t>why</w:t>
+      </w:r>
+      <w:r>
+        <w:rPr>
+          <w:b w:val="0"/>
+          <w:sz w:val="21"/>
+        </w:rPr>
+        <w:t xml:space="preserve"> (what was wrong) and a </w:t>
+      </w:r>
+      <w:r>
+        <w:rPr>
+          <w:b/>
+          <w:sz w:val="21"/>
+        </w:rPr>
+        <w:t>check</w:t>
+      </w:r>
+      <w:r>
+        <w:rPr>
+          <w:b w:val="0"/>
+          <w:sz w:val="21"/>
+        </w:rPr>
+        <w:t xml:space="preserve"> (the command it ran, which you can run yourself). Tasks for the other node are listed as "not graded here". A line saying a later check "did not run" means fix the first problem, then grade again.</w:t>
+      </w:r>
+    </w:p>
+    <w:p>
+      <w:pPr>
+        <w:keepNext w:val="0"/>
+        <w:tabs>
+          <w:tab w:pos="605" w:val="left"/>
+        </w:tabs>
+        <w:spacing w:before="120" w:after="60"/>
+        <w:ind w:left="605" w:hanging="605"/>
+      </w:pPr>
+      <w:r>
+        <w:rPr>
+          <w:b/>
+          <w:sz w:val="21"/>
+        </w:rPr>
+        <w:t>4.</w:t>
+        <w:tab/>
+      </w:r>
+      <w:r>
+        <w:rPr>
+          <w:b/>
+          <w:sz w:val="21"/>
+        </w:rPr>
+        <w:t>Work out your score.</w:t>
+      </w:r>
+      <w:r>
+        <w:rPr>
+          <w:b w:val="0"/>
+          <w:sz w:val="21"/>
+        </w:rPr>
+        <w:t xml:space="preserve"> Each node prints a score for its own tasks only. Your exam score is </w:t>
+      </w:r>
+      <w:r>
+        <w:rPr>
+          <w:b/>
+          <w:sz w:val="21"/>
+        </w:rPr>
+        <w:t>300 × (tasks passed on node1 + tasks passed on node2) ÷ 26</w:t>
+      </w:r>
+      <w:r>
+        <w:rPr>
+          <w:b w:val="0"/>
+          <w:sz w:val="21"/>
+        </w:rPr>
+        <w:t>. The pass mark is 210.</w:t>
+      </w:r>
+    </w:p>
+    <w:p>
+      <w:pPr>
+        <w:keepNext w:val="0"/>
+        <w:tabs>
+          <w:tab w:pos="605" w:val="left"/>
+        </w:tabs>
+        <w:spacing w:before="120" w:after="60"/>
+        <w:ind w:left="605" w:hanging="605"/>
+      </w:pPr>
+      <w:r>
+        <w:rPr>
+          <w:b/>
+          <w:sz w:val="21"/>
+        </w:rPr>
+        <w:t>5.</w:t>
+        <w:tab/>
+      </w:r>
+      <w:r>
+        <w:rPr>
+          <w:b/>
+          <w:sz w:val="21"/>
+        </w:rPr>
+        <w:t>Check failures against the key,</w:t>
+      </w:r>
+      <w:r>
+        <w:rPr>
+          <w:b w:val="0"/>
+          <w:sz w:val="21"/>
+        </w:rPr>
+        <w:t xml:space="preserve"> fix them, reboot and grade again. To start over, restore the </w:t>
+      </w:r>
+      <w:r>
+        <w:rPr>
+          <w:rFonts w:ascii="Courier New" w:hAnsi="Courier New" w:eastAsia="Courier New"/>
+          <w:b w:val="0"/>
+          <w:color w:val="C2560B"/>
+          <w:sz w:val="19"/>
+        </w:rPr>
+        <w:t>start</w:t>
+      </w:r>
+      <w:r>
+        <w:rPr>
+          <w:b w:val="0"/>
+          <w:sz w:val="21"/>
+        </w:rPr>
+        <w:t xml:space="preserve"> snapshots.</w:t>
+      </w:r>
     </w:p>
     <w:sectPr>
       <w:pgSz w:w="11909" w:h="16834"/>

</xml_diff>